<commit_message>
Update report with images
</commit_message>
<xml_diff>
--- a/Report/Assignment 03 - Melbourne_14.docx
+++ b/Report/Assignment 03 - Melbourne_14.docx
@@ -1,6 +1,6 @@
 
 <file path=word/document.xml><?xml version="1.0" encoding="utf-8"?>
-<w:document xmlns:wpc="http://schemas.microsoft.com/office/word/2010/wordprocessingCanvas" xmlns:cx="http://schemas.microsoft.com/office/drawing/2014/chartex" xmlns:cx1="http://schemas.microsoft.com/office/drawing/2015/9/8/chartex" xmlns:cx2="http://schemas.microsoft.com/office/drawing/2015/10/21/chartex" xmlns:cx3="http://schemas.microsoft.com/office/drawing/2016/5/9/chartex" xmlns:cx4="http://schemas.microsoft.com/office/drawing/2016/5/10/chartex" xmlns:cx5="http://schemas.microsoft.com/office/drawing/2016/5/11/chartex" xmlns:cx6="http://schemas.microsoft.com/office/drawing/2016/5/12/chartex" xmlns:cx7="http://schemas.microsoft.com/office/drawing/2016/5/13/chartex" xmlns:cx8="http://schemas.microsoft.com/office/drawing/2016/5/14/chartex" xmlns:mc="http://schemas.openxmlformats.org/markup-compatibility/2006" xmlns:aink="http://schemas.microsoft.com/office/drawing/2016/ink" xmlns:am3d="http://schemas.microsoft.com/office/drawing/2017/model3d" xmlns:o="urn:schemas-microsoft-com:office:office" xmlns:oel="http://schemas.microsoft.com/office/2019/extlst" xmlns:r="http://schemas.openxmlformats.org/officeDocument/2006/relationships" xmlns:m="http://schemas.openxmlformats.org/officeDocument/2006/math" xmlns:v="urn:schemas-microsoft-com:vml" xmlns:wp14="http://schemas.microsoft.com/office/word/2010/wordprocessingDrawing" xmlns:wp="http://schemas.openxmlformats.org/drawingml/2006/wordprocessingDrawing" xmlns:w10="urn:schemas-microsoft-com:office:word" xmlns:w="http://schemas.openxmlformats.org/wordprocessingml/2006/main" xmlns:w14="http://schemas.microsoft.com/office/word/2010/wordml" xmlns:w15="http://schemas.microsoft.com/office/word/2012/wordml" xmlns:w16cex="http://schemas.microsoft.com/office/word/2018/wordml/cex" xmlns:w16cid="http://schemas.microsoft.com/office/word/2016/wordml/cid" xmlns:w16="http://schemas.microsoft.com/office/word/2018/wordml" xmlns:w16du="http://schemas.microsoft.com/office/word/2023/wordml/word16du" xmlns:w16sdtdh="http://schemas.microsoft.com/office/word/2020/wordml/sdtdatahash" xmlns:w16sdtfl="http://schemas.microsoft.com/office/word/2024/wordml/sdtformatlock" xmlns:w16se="http://schemas.microsoft.com/office/word/2015/wordml/symex" xmlns:wpg="http://schemas.microsoft.com/office/word/2010/wordprocessingGroup" xmlns:wpi="http://schemas.microsoft.com/office/word/2010/wordprocessingInk" xmlns:wne="http://schemas.microsoft.com/office/word/2006/wordml" xmlns:wps="http://schemas.microsoft.com/office/word/2010/wordprocessingShape" mc:Ignorable="w14 w15 w16se w16cid w16 w16cex w16sdtdh w16sdtfl w16du wp14">
+<w:document xmlns:wpc="http://schemas.microsoft.com/office/word/2010/wordprocessingCanvas" xmlns:cx="http://schemas.microsoft.com/office/drawing/2014/chartex" xmlns:cx1="http://schemas.microsoft.com/office/drawing/2015/9/8/chartex" xmlns:cx2="http://schemas.microsoft.com/office/drawing/2015/10/21/chartex" xmlns:cx3="http://schemas.microsoft.com/office/drawing/2016/5/9/chartex" xmlns:cx4="http://schemas.microsoft.com/office/drawing/2016/5/10/chartex" xmlns:cx5="http://schemas.microsoft.com/office/drawing/2016/5/11/chartex" xmlns:cx6="http://schemas.microsoft.com/office/drawing/2016/5/12/chartex" xmlns:cx7="http://schemas.microsoft.com/office/drawing/2016/5/13/chartex" xmlns:cx8="http://schemas.microsoft.com/office/drawing/2016/5/14/chartex" xmlns:mc="http://schemas.openxmlformats.org/markup-compatibility/2006" xmlns:aink="http://schemas.microsoft.com/office/drawing/2016/ink" xmlns:am3d="http://schemas.microsoft.com/office/drawing/2017/model3d" xmlns:o="urn:schemas-microsoft-com:office:office" xmlns:oel="http://schemas.microsoft.com/office/2019/extlst" xmlns:r="http://schemas.openxmlformats.org/officeDocument/2006/relationships" xmlns:m="http://schemas.openxmlformats.org/officeDocument/2006/math" xmlns:v="urn:schemas-microsoft-com:vml" xmlns:wp14="http://schemas.microsoft.com/office/word/2010/wordprocessingDrawing" xmlns:wp="http://schemas.openxmlformats.org/drawingml/2006/wordprocessingDrawing" xmlns:w10="urn:schemas-microsoft-com:office:word" xmlns:w="http://schemas.openxmlformats.org/wordprocessingml/2006/main" xmlns:w14="http://schemas.microsoft.com/office/word/2010/wordml" xmlns:w15="http://schemas.microsoft.com/office/word/2012/wordml" xmlns:w16cex="http://schemas.microsoft.com/office/word/2018/wordml/cex" xmlns:w16cid="http://schemas.microsoft.com/office/word/2016/wordml/cid" xmlns:w16="http://schemas.microsoft.com/office/word/2018/wordml" xmlns:w16sdtdh="http://schemas.microsoft.com/office/word/2020/wordml/sdtdatahash" xmlns:w16se="http://schemas.microsoft.com/office/word/2015/wordml/symex" xmlns:wpg="http://schemas.microsoft.com/office/word/2010/wordprocessingGroup" xmlns:wpi="http://schemas.microsoft.com/office/word/2010/wordprocessingInk" xmlns:wne="http://schemas.microsoft.com/office/word/2006/wordml" xmlns:wps="http://schemas.microsoft.com/office/word/2010/wordprocessingShape" mc:Ignorable="w14 w15 w16se w16cid w16 w16cex w16sdtdh wp14">
   <w:body>
     <w:p>
       <w:pPr>
@@ -437,7 +437,7 @@
                 <w:sz w:val="22"/>
                 <w:szCs w:val="22"/>
               </w:rPr>
-              <w:t xml:space="preserve">Based on the Needs Analysis and Usability Test Report (Assessment 2) by Udith Madushan Jayasinghe </w:t>
+              <w:t xml:space="preserve">Based on the Needs Analysis and Usability Test Report (Assessment 2) by </w:t>
             </w:r>
             <w:proofErr w:type="spellStart"/>
             <w:r>
@@ -450,7 +450,7 @@
                 <w:sz w:val="22"/>
                 <w:szCs w:val="22"/>
               </w:rPr>
-              <w:t>Jayasinghe</w:t>
+              <w:t>Udith</w:t>
             </w:r>
             <w:proofErr w:type="spellEnd"/>
             <w:r>
@@ -463,7 +463,85 @@
                 <w:sz w:val="22"/>
                 <w:szCs w:val="22"/>
               </w:rPr>
-              <w:t xml:space="preserve"> Arachchige (ID 69191)</w:t>
+              <w:t xml:space="preserve"> </w:t>
+            </w:r>
+            <w:proofErr w:type="spellStart"/>
+            <w:r>
+              <w:rPr>
+                <w:rStyle w:val="SubtleEmphasis"/>
+                <w:rFonts w:ascii="Calibri" w:hAnsi="Calibri" w:cs="Calibri"/>
+                <w:i w:val="0"/>
+                <w:iCs w:val="0"/>
+                <w:color w:val="auto"/>
+                <w:sz w:val="22"/>
+                <w:szCs w:val="22"/>
+              </w:rPr>
+              <w:t>Madushan</w:t>
+            </w:r>
+            <w:proofErr w:type="spellEnd"/>
+            <w:r>
+              <w:rPr>
+                <w:rStyle w:val="SubtleEmphasis"/>
+                <w:rFonts w:ascii="Calibri" w:hAnsi="Calibri" w:cs="Calibri"/>
+                <w:i w:val="0"/>
+                <w:iCs w:val="0"/>
+                <w:color w:val="auto"/>
+                <w:sz w:val="22"/>
+                <w:szCs w:val="22"/>
+              </w:rPr>
+              <w:t xml:space="preserve"> Jayasinghe </w:t>
+            </w:r>
+            <w:proofErr w:type="spellStart"/>
+            <w:r>
+              <w:rPr>
+                <w:rStyle w:val="SubtleEmphasis"/>
+                <w:rFonts w:ascii="Calibri" w:hAnsi="Calibri" w:cs="Calibri"/>
+                <w:i w:val="0"/>
+                <w:iCs w:val="0"/>
+                <w:color w:val="auto"/>
+                <w:sz w:val="22"/>
+                <w:szCs w:val="22"/>
+              </w:rPr>
+              <w:t>Jayasinghe</w:t>
+            </w:r>
+            <w:proofErr w:type="spellEnd"/>
+            <w:r>
+              <w:rPr>
+                <w:rStyle w:val="SubtleEmphasis"/>
+                <w:rFonts w:ascii="Calibri" w:hAnsi="Calibri" w:cs="Calibri"/>
+                <w:i w:val="0"/>
+                <w:iCs w:val="0"/>
+                <w:color w:val="auto"/>
+                <w:sz w:val="22"/>
+                <w:szCs w:val="22"/>
+              </w:rPr>
+              <w:t xml:space="preserve"> </w:t>
+            </w:r>
+            <w:proofErr w:type="spellStart"/>
+            <w:r>
+              <w:rPr>
+                <w:rStyle w:val="SubtleEmphasis"/>
+                <w:rFonts w:ascii="Calibri" w:hAnsi="Calibri" w:cs="Calibri"/>
+                <w:i w:val="0"/>
+                <w:iCs w:val="0"/>
+                <w:color w:val="auto"/>
+                <w:sz w:val="22"/>
+                <w:szCs w:val="22"/>
+              </w:rPr>
+              <w:t>Arachchige</w:t>
+            </w:r>
+            <w:proofErr w:type="spellEnd"/>
+            <w:r>
+              <w:rPr>
+                <w:rStyle w:val="SubtleEmphasis"/>
+                <w:rFonts w:ascii="Calibri" w:hAnsi="Calibri" w:cs="Calibri"/>
+                <w:i w:val="0"/>
+                <w:iCs w:val="0"/>
+                <w:color w:val="auto"/>
+                <w:sz w:val="22"/>
+                <w:szCs w:val="22"/>
+              </w:rPr>
+              <w:t xml:space="preserve"> (ID 69191)</w:t>
             </w:r>
           </w:p>
           <w:p>
@@ -626,13 +704,41 @@
                       <w:szCs w:val="28"/>
                     </w:rPr>
                   </w:pPr>
+                  <w:proofErr w:type="spellStart"/>
                   <w:r>
                     <w:rPr>
                       <w:rFonts w:ascii="Calibri" w:eastAsia="MS Gothic" w:hAnsi="Calibri" w:cs="Calibri"/>
                       <w:sz w:val="28"/>
                       <w:szCs w:val="28"/>
                     </w:rPr>
-                    <w:t xml:space="preserve">Udith Madushan Jayasinghe </w:t>
+                    <w:t>Udith</w:t>
+                  </w:r>
+                  <w:proofErr w:type="spellEnd"/>
+                  <w:r>
+                    <w:rPr>
+                      <w:rFonts w:ascii="Calibri" w:eastAsia="MS Gothic" w:hAnsi="Calibri" w:cs="Calibri"/>
+                      <w:sz w:val="28"/>
+                      <w:szCs w:val="28"/>
+                    </w:rPr>
+                    <w:t xml:space="preserve"> </w:t>
+                  </w:r>
+                  <w:proofErr w:type="spellStart"/>
+                  <w:r>
+                    <w:rPr>
+                      <w:rFonts w:ascii="Calibri" w:eastAsia="MS Gothic" w:hAnsi="Calibri" w:cs="Calibri"/>
+                      <w:sz w:val="28"/>
+                      <w:szCs w:val="28"/>
+                    </w:rPr>
+                    <w:t>Madushan</w:t>
+                  </w:r>
+                  <w:proofErr w:type="spellEnd"/>
+                  <w:r>
+                    <w:rPr>
+                      <w:rFonts w:ascii="Calibri" w:eastAsia="MS Gothic" w:hAnsi="Calibri" w:cs="Calibri"/>
+                      <w:sz w:val="28"/>
+                      <w:szCs w:val="28"/>
+                    </w:rPr>
+                    <w:t xml:space="preserve"> Jayasinghe </w:t>
                   </w:r>
                   <w:proofErr w:type="spellStart"/>
                   <w:r>
@@ -650,8 +756,18 @@
                       <w:sz w:val="28"/>
                       <w:szCs w:val="28"/>
                     </w:rPr>
-                    <w:t xml:space="preserve"> Arachchige</w:t>
+                    <w:t xml:space="preserve"> </w:t>
                   </w:r>
+                  <w:proofErr w:type="spellStart"/>
+                  <w:r>
+                    <w:rPr>
+                      <w:rFonts w:ascii="Calibri" w:eastAsia="MS Gothic" w:hAnsi="Calibri" w:cs="Calibri"/>
+                      <w:sz w:val="28"/>
+                      <w:szCs w:val="28"/>
+                    </w:rPr>
+                    <w:t>Arachchige</w:t>
+                  </w:r>
+                  <w:proofErr w:type="spellEnd"/>
                 </w:p>
               </w:tc>
               <w:tc>
@@ -707,7 +823,43 @@
                       <w:sz w:val="28"/>
                       <w:szCs w:val="28"/>
                     </w:rPr>
-                    <w:t xml:space="preserve"> Sugandha Kapurubandara Arachchige Don</w:t>
+                    <w:t xml:space="preserve"> Sugandha </w:t>
+                  </w:r>
+                  <w:proofErr w:type="spellStart"/>
+                  <w:r>
+                    <w:rPr>
+                      <w:rFonts w:ascii="Calibri" w:eastAsia="MS Gothic" w:hAnsi="Calibri" w:cs="Calibri"/>
+                      <w:sz w:val="28"/>
+                      <w:szCs w:val="28"/>
+                    </w:rPr>
+                    <w:t>Kapurubandara</w:t>
+                  </w:r>
+                  <w:proofErr w:type="spellEnd"/>
+                  <w:r>
+                    <w:rPr>
+                      <w:rFonts w:ascii="Calibri" w:eastAsia="MS Gothic" w:hAnsi="Calibri" w:cs="Calibri"/>
+                      <w:sz w:val="28"/>
+                      <w:szCs w:val="28"/>
+                    </w:rPr>
+                    <w:t xml:space="preserve"> </w:t>
+                  </w:r>
+                  <w:proofErr w:type="spellStart"/>
+                  <w:r>
+                    <w:rPr>
+                      <w:rFonts w:ascii="Calibri" w:eastAsia="MS Gothic" w:hAnsi="Calibri" w:cs="Calibri"/>
+                      <w:sz w:val="28"/>
+                      <w:szCs w:val="28"/>
+                    </w:rPr>
+                    <w:t>Arachchige</w:t>
+                  </w:r>
+                  <w:proofErr w:type="spellEnd"/>
+                  <w:r>
+                    <w:rPr>
+                      <w:rFonts w:ascii="Calibri" w:eastAsia="MS Gothic" w:hAnsi="Calibri" w:cs="Calibri"/>
+                      <w:sz w:val="28"/>
+                      <w:szCs w:val="28"/>
+                    </w:rPr>
+                    <w:t xml:space="preserve"> Don</w:t>
                   </w:r>
                 </w:p>
               </w:tc>
@@ -924,7 +1076,7 @@
     <w:sdt>
       <w:sdtPr>
         <w:rPr>
-          <w:rFonts w:eastAsiaTheme="minorEastAsia" w:cs="Calibri"/>
+          <w:rFonts w:asciiTheme="minorHAnsi" w:eastAsiaTheme="minorEastAsia" w:hAnsiTheme="minorHAnsi" w:cs="Calibri"/>
           <w:color w:val="auto"/>
           <w:sz w:val="24"/>
           <w:szCs w:val="24"/>
@@ -3826,23 +3978,7 @@
             <w:rFonts w:ascii="Calibri" w:hAnsi="Calibri" w:cs="Calibri"/>
             <w:noProof/>
           </w:rPr>
-          <w:t>Figure 3: Redesigned home screen, bank transfer screen and Bin</w:t>
-        </w:r>
-        <w:r>
-          <w:rPr>
-            <w:rStyle w:val="Hyperlink"/>
-            <w:rFonts w:ascii="Calibri" w:hAnsi="Calibri" w:cs="Calibri"/>
-            <w:noProof/>
-          </w:rPr>
-          <w:t>a</w:t>
-        </w:r>
-        <w:r>
-          <w:rPr>
-            <w:rStyle w:val="Hyperlink"/>
-            <w:rFonts w:ascii="Calibri" w:hAnsi="Calibri" w:cs="Calibri"/>
-            <w:noProof/>
-          </w:rPr>
-          <w:t>nce AI help screen</w:t>
+          <w:t>Figure 3: Redesigned home screen, bank transfer screen and Binance AI help screen</w:t>
         </w:r>
         <w:r>
           <w:rPr>
@@ -4413,7 +4549,7 @@
           <w:szCs w:val="22"/>
           <w:lang w:eastAsia="en-US"/>
         </w:rPr>
-        <w:t xml:space="preserve">This report is in response to those results. The group based its design on the report by Udith Madushan Jayasinghe </w:t>
+        <w:t xml:space="preserve">This report is in response to those results. The group based its design on the report by </w:t>
       </w:r>
       <w:proofErr w:type="spellStart"/>
       <w:r>
@@ -4423,6 +4559,46 @@
           <w:szCs w:val="22"/>
           <w:lang w:eastAsia="en-US"/>
         </w:rPr>
+        <w:t>Udith</w:t>
+      </w:r>
+      <w:proofErr w:type="spellEnd"/>
+      <w:r>
+        <w:rPr>
+          <w:rFonts w:ascii="Calibri" w:hAnsi="Calibri" w:cs="Calibri"/>
+          <w:sz w:val="22"/>
+          <w:szCs w:val="22"/>
+          <w:lang w:eastAsia="en-US"/>
+        </w:rPr>
+        <w:t xml:space="preserve"> </w:t>
+      </w:r>
+      <w:proofErr w:type="spellStart"/>
+      <w:r>
+        <w:rPr>
+          <w:rFonts w:ascii="Calibri" w:hAnsi="Calibri" w:cs="Calibri"/>
+          <w:sz w:val="22"/>
+          <w:szCs w:val="22"/>
+          <w:lang w:eastAsia="en-US"/>
+        </w:rPr>
+        <w:t>Madushan</w:t>
+      </w:r>
+      <w:proofErr w:type="spellEnd"/>
+      <w:r>
+        <w:rPr>
+          <w:rFonts w:ascii="Calibri" w:hAnsi="Calibri" w:cs="Calibri"/>
+          <w:sz w:val="22"/>
+          <w:szCs w:val="22"/>
+          <w:lang w:eastAsia="en-US"/>
+        </w:rPr>
+        <w:t xml:space="preserve"> Jayasinghe </w:t>
+      </w:r>
+      <w:proofErr w:type="spellStart"/>
+      <w:r>
+        <w:rPr>
+          <w:rFonts w:ascii="Calibri" w:hAnsi="Calibri" w:cs="Calibri"/>
+          <w:sz w:val="22"/>
+          <w:szCs w:val="22"/>
+          <w:lang w:eastAsia="en-US"/>
+        </w:rPr>
         <w:t>Jayasinghe</w:t>
       </w:r>
       <w:proofErr w:type="spellEnd"/>
@@ -4433,9 +4609,9 @@
           <w:szCs w:val="22"/>
           <w:lang w:eastAsia="en-US"/>
         </w:rPr>
-        <w:t xml:space="preserve"> Arachchige (ID 69191) in Assessment 2 and developed, justified and evaluated concept design for the home page, buying and selling flows, bank transfer page and </w:t>
+        <w:t xml:space="preserve"> </w:t>
       </w:r>
-      <w:proofErr w:type="gramStart"/>
+      <w:proofErr w:type="spellStart"/>
       <w:r>
         <w:rPr>
           <w:rFonts w:ascii="Calibri" w:hAnsi="Calibri" w:cs="Calibri"/>
@@ -4443,9 +4619,9 @@
           <w:szCs w:val="22"/>
           <w:lang w:eastAsia="en-US"/>
         </w:rPr>
-        <w:t>help</w:t>
+        <w:t>Arachchige</w:t>
       </w:r>
-      <w:proofErr w:type="gramEnd"/>
+      <w:proofErr w:type="spellEnd"/>
       <w:r>
         <w:rPr>
           <w:rFonts w:ascii="Calibri" w:hAnsi="Calibri" w:cs="Calibri"/>
@@ -4453,7 +4629,7 @@
           <w:szCs w:val="22"/>
           <w:lang w:eastAsia="en-US"/>
         </w:rPr>
-        <w:t xml:space="preserve"> entry point. This is a coursework concept, not associated with Binance, and all numbers presented in the screens are purely illustrative.</w:t>
+        <w:t xml:space="preserve"> (ID 69191) in Assessment 2 and developed, justified and evaluated concept design for the home page, buying and selling flows, bank transfer page and help entry point. This is a coursework concept, not associated with Binance, and all numbers presented in the screens are purely illustrative.</w:t>
       </w:r>
     </w:p>
     <w:p>
@@ -5597,7 +5773,6 @@
         </w:rPr>
         <w:t xml:space="preserve">Objectives are the group goals, and they should be challenging yet realistic, bearing in mind the achievement of 10.4 seconds by the chatbot, a guided purpose-built screen. The qualitative objectives </w:t>
       </w:r>
-      <w:proofErr w:type="gramStart"/>
       <w:r>
         <w:rPr>
           <w:rFonts w:ascii="Calibri" w:hAnsi="Calibri" w:cs="Calibri"/>
@@ -5606,17 +5781,7 @@
           <w:lang w:eastAsia="en-US"/>
         </w:rPr>
         <w:lastRenderedPageBreak/>
-        <w:t>are such</w:t>
-      </w:r>
-      <w:proofErr w:type="gramEnd"/>
-      <w:r>
-        <w:rPr>
-          <w:rFonts w:ascii="Calibri" w:hAnsi="Calibri" w:cs="Calibri"/>
-          <w:sz w:val="22"/>
-          <w:szCs w:val="22"/>
-          <w:lang w:eastAsia="en-US"/>
-        </w:rPr>
-        <w:t xml:space="preserve"> that all screens will clearly show the next step, all users will know where they are in a multiple-step process, all users can preview before completing an action, and all screens will adhere to WCAG 2.2 Level AA </w:t>
+        <w:t xml:space="preserve">are such that all screens will clearly show the next step, all users will know where they are in a multiple-step process, all users can preview before completing an action, and all screens will adhere to WCAG 2.2 Level AA </w:t>
       </w:r>
       <w:sdt>
         <w:sdtPr>
@@ -5721,13 +5886,7 @@
         <w:rPr>
           <w:rFonts w:cs="Calibri"/>
         </w:rPr>
-        <w:t xml:space="preserve">2.1 </w:t>
-      </w:r>
-      <w:r>
-        <w:rPr>
-          <w:rFonts w:cs="Calibri"/>
-        </w:rPr>
-        <w:t>Methodology</w:t>
+        <w:t>2.1 Methodology</w:t>
       </w:r>
       <w:bookmarkEnd w:id="6"/>
     </w:p>
@@ -5840,19 +5999,7 @@
         <w:rPr>
           <w:rFonts w:cs="Calibri"/>
         </w:rPr>
-        <w:t>2.</w:t>
-      </w:r>
-      <w:r>
-        <w:rPr>
-          <w:rFonts w:cs="Calibri"/>
-        </w:rPr>
-        <w:t>2</w:t>
-      </w:r>
-      <w:r>
-        <w:rPr>
-          <w:rFonts w:cs="Calibri"/>
-        </w:rPr>
-        <w:t xml:space="preserve"> </w:t>
+        <w:t xml:space="preserve">2.2 </w:t>
       </w:r>
       <w:r>
         <w:rPr>
@@ -5879,27 +6026,7 @@
           <w:szCs w:val="22"/>
           <w:lang w:eastAsia="en-US"/>
         </w:rPr>
-        <w:t xml:space="preserve">Before the design process started, we reviewed </w:t>
-      </w:r>
-      <w:proofErr w:type="gramStart"/>
-      <w:r>
-        <w:rPr>
-          <w:rFonts w:ascii="Calibri" w:hAnsi="Calibri" w:cs="Calibri"/>
-          <w:sz w:val="22"/>
-          <w:szCs w:val="22"/>
-          <w:lang w:eastAsia="en-US"/>
-        </w:rPr>
-        <w:t>the Assessment</w:t>
-      </w:r>
-      <w:proofErr w:type="gramEnd"/>
-      <w:r>
-        <w:rPr>
-          <w:rFonts w:ascii="Calibri" w:hAnsi="Calibri" w:cs="Calibri"/>
-          <w:sz w:val="22"/>
-          <w:szCs w:val="22"/>
-          <w:lang w:eastAsia="en-US"/>
-        </w:rPr>
-        <w:t xml:space="preserve"> 2 screenshots (Figure 1). Three structural issues caused the problem in the data. The first is that the Buy and Sell screens contain amount, method of payment, an offer to subscribe and the information about the counterparty on one screen, which makes the interface cognitively overloaded </w:t>
+        <w:t xml:space="preserve">Before the design process started, we reviewed the Assessment 2 screenshots (Figure 1). Three structural issues caused the problem in the data. The first is that the Buy and Sell screens contain amount, method of payment, an offer to subscribe and the information about the counterparty on one screen, which makes the interface cognitively overloaded </w:t>
       </w:r>
       <w:sdt>
         <w:sdtPr>
@@ -5968,28 +6095,408 @@
           <w:szCs w:val="22"/>
           <w:lang w:eastAsia="en-US"/>
         </w:rPr>
-        <w:t xml:space="preserve"> and does not show the starting point. The second issue is that on the Sell screen, the information about the requirements of the counterparty appears as a long text without formatting, which forces users to read and filter to do something. Third, on the home screen, the user sees the balance, onboarding, big call-to-action, grid of shortcuts and scrolling tab bar all at once. The chatbot performed the best because it had one purpose, </w:t>
+        <w:t xml:space="preserve"> and does not show the starting point. The second issue is that on the Sell screen, the information about the requirements of the counterparty appears as a long text without formatting, which forces users to read and filter to do something. Third, on the home screen, the user sees the balance, onboarding, big call-to-action, grid of shortcuts and scrolling tab bar all at once. The chatbot performed the best because it had one purpose, short suggested questions and one input.</w:t>
       </w:r>
-      <w:proofErr w:type="gramStart"/>
-      <w:r>
+    </w:p>
+    <w:p>
+      <w:pPr>
+        <w:jc w:val="both"/>
         <w:rPr>
           <w:rFonts w:ascii="Calibri" w:hAnsi="Calibri" w:cs="Calibri"/>
           <w:sz w:val="22"/>
           <w:szCs w:val="22"/>
           <w:lang w:eastAsia="en-US"/>
         </w:rPr>
-        <w:t>short suggested</w:t>
+      </w:pPr>
+      <w:r>
+        <w:rPr>
+          <w:noProof/>
+        </w:rPr>
+        <w:lastRenderedPageBreak/>
+        <w:drawing>
+          <wp:anchor distT="0" distB="0" distL="114300" distR="114300" simplePos="0" relativeHeight="251679744" behindDoc="0" locked="0" layoutInCell="1" allowOverlap="1" wp14:anchorId="7E933343" wp14:editId="7B066C38">
+            <wp:simplePos x="0" y="0"/>
+            <wp:positionH relativeFrom="column">
+              <wp:posOffset>-202565</wp:posOffset>
+            </wp:positionH>
+            <wp:positionV relativeFrom="paragraph">
+              <wp:posOffset>4312285</wp:posOffset>
+            </wp:positionV>
+            <wp:extent cx="1762125" cy="3822065"/>
+            <wp:effectExtent l="0" t="0" r="9525" b="6985"/>
+            <wp:wrapTopAndBottom/>
+            <wp:docPr id="20" name="Picture 20"/>
+            <wp:cNvGraphicFramePr>
+              <a:graphicFrameLocks xmlns:a="http://schemas.openxmlformats.org/drawingml/2006/main" noChangeAspect="1"/>
+            </wp:cNvGraphicFramePr>
+            <a:graphic xmlns:a="http://schemas.openxmlformats.org/drawingml/2006/main">
+              <a:graphicData uri="http://schemas.openxmlformats.org/drawingml/2006/picture">
+                <pic:pic xmlns:pic="http://schemas.openxmlformats.org/drawingml/2006/picture">
+                  <pic:nvPicPr>
+                    <pic:cNvPr id="0" name="Picture 33"/>
+                    <pic:cNvPicPr>
+                      <a:picLocks noChangeAspect="1" noChangeArrowheads="1"/>
+                    </pic:cNvPicPr>
+                  </pic:nvPicPr>
+                  <pic:blipFill>
+                    <a:blip r:embed="rId10" cstate="print">
+                      <a:extLst>
+                        <a:ext uri="{28A0092B-C50C-407E-A947-70E740481C1C}">
+                          <a14:useLocalDpi xmlns:a14="http://schemas.microsoft.com/office/drawing/2010/main" val="0"/>
+                        </a:ext>
+                      </a:extLst>
+                    </a:blip>
+                    <a:srcRect/>
+                    <a:stretch>
+                      <a:fillRect/>
+                    </a:stretch>
+                  </pic:blipFill>
+                  <pic:spPr bwMode="auto">
+                    <a:xfrm>
+                      <a:off x="0" y="0"/>
+                      <a:ext cx="1762125" cy="3822065"/>
+                    </a:xfrm>
+                    <a:prstGeom prst="rect">
+                      <a:avLst/>
+                    </a:prstGeom>
+                    <a:noFill/>
+                    <a:ln>
+                      <a:noFill/>
+                    </a:ln>
+                  </pic:spPr>
+                </pic:pic>
+              </a:graphicData>
+            </a:graphic>
+          </wp:anchor>
+        </w:drawing>
       </w:r>
-      <w:proofErr w:type="gramEnd"/>
       <w:r>
+        <w:rPr>
+          <w:noProof/>
+        </w:rPr>
+        <w:drawing>
+          <wp:anchor distT="0" distB="0" distL="114300" distR="114300" simplePos="0" relativeHeight="251676672" behindDoc="0" locked="0" layoutInCell="1" allowOverlap="1" wp14:anchorId="1B59CC3F" wp14:editId="0C9E7236">
+            <wp:simplePos x="0" y="0"/>
+            <wp:positionH relativeFrom="margin">
+              <wp:posOffset>3622040</wp:posOffset>
+            </wp:positionH>
+            <wp:positionV relativeFrom="paragraph">
+              <wp:posOffset>4314190</wp:posOffset>
+            </wp:positionV>
+            <wp:extent cx="1762403" cy="3822192"/>
+            <wp:effectExtent l="0" t="0" r="9525" b="6985"/>
+            <wp:wrapTopAndBottom/>
+            <wp:docPr id="23" name="Picture 23"/>
+            <wp:cNvGraphicFramePr>
+              <a:graphicFrameLocks xmlns:a="http://schemas.openxmlformats.org/drawingml/2006/main" noChangeAspect="1"/>
+            </wp:cNvGraphicFramePr>
+            <a:graphic xmlns:a="http://schemas.openxmlformats.org/drawingml/2006/main">
+              <a:graphicData uri="http://schemas.openxmlformats.org/drawingml/2006/picture">
+                <pic:pic xmlns:pic="http://schemas.openxmlformats.org/drawingml/2006/picture">
+                  <pic:nvPicPr>
+                    <pic:cNvPr id="0" name="Picture 36"/>
+                    <pic:cNvPicPr>
+                      <a:picLocks noChangeAspect="1" noChangeArrowheads="1"/>
+                    </pic:cNvPicPr>
+                  </pic:nvPicPr>
+                  <pic:blipFill>
+                    <a:blip r:embed="rId11" cstate="print">
+                      <a:extLst>
+                        <a:ext uri="{28A0092B-C50C-407E-A947-70E740481C1C}">
+                          <a14:useLocalDpi xmlns:a14="http://schemas.microsoft.com/office/drawing/2010/main" val="0"/>
+                        </a:ext>
+                      </a:extLst>
+                    </a:blip>
+                    <a:srcRect/>
+                    <a:stretch>
+                      <a:fillRect/>
+                    </a:stretch>
+                  </pic:blipFill>
+                  <pic:spPr bwMode="auto">
+                    <a:xfrm>
+                      <a:off x="0" y="0"/>
+                      <a:ext cx="1762403" cy="3822192"/>
+                    </a:xfrm>
+                    <a:prstGeom prst="rect">
+                      <a:avLst/>
+                    </a:prstGeom>
+                    <a:noFill/>
+                    <a:ln>
+                      <a:noFill/>
+                    </a:ln>
+                  </pic:spPr>
+                </pic:pic>
+              </a:graphicData>
+            </a:graphic>
+          </wp:anchor>
+        </w:drawing>
+      </w:r>
+      <w:r>
+        <w:rPr>
+          <w:noProof/>
+        </w:rPr>
+        <w:drawing>
+          <wp:anchor distT="0" distB="0" distL="114300" distR="114300" simplePos="0" relativeHeight="251677696" behindDoc="0" locked="0" layoutInCell="1" allowOverlap="1" wp14:anchorId="5EFD3D5D" wp14:editId="35904727">
+            <wp:simplePos x="0" y="0"/>
+            <wp:positionH relativeFrom="column">
+              <wp:posOffset>1709420</wp:posOffset>
+            </wp:positionH>
+            <wp:positionV relativeFrom="paragraph">
+              <wp:posOffset>4314825</wp:posOffset>
+            </wp:positionV>
+            <wp:extent cx="1762403" cy="3822192"/>
+            <wp:effectExtent l="0" t="0" r="9525" b="6985"/>
+            <wp:wrapTopAndBottom/>
+            <wp:docPr id="22" name="Picture 22"/>
+            <wp:cNvGraphicFramePr>
+              <a:graphicFrameLocks xmlns:a="http://schemas.openxmlformats.org/drawingml/2006/main" noChangeAspect="1"/>
+            </wp:cNvGraphicFramePr>
+            <a:graphic xmlns:a="http://schemas.openxmlformats.org/drawingml/2006/main">
+              <a:graphicData uri="http://schemas.openxmlformats.org/drawingml/2006/picture">
+                <pic:pic xmlns:pic="http://schemas.openxmlformats.org/drawingml/2006/picture">
+                  <pic:nvPicPr>
+                    <pic:cNvPr id="0" name="Picture 35"/>
+                    <pic:cNvPicPr>
+                      <a:picLocks noChangeAspect="1" noChangeArrowheads="1"/>
+                    </pic:cNvPicPr>
+                  </pic:nvPicPr>
+                  <pic:blipFill>
+                    <a:blip r:embed="rId12" cstate="print">
+                      <a:extLst>
+                        <a:ext uri="{28A0092B-C50C-407E-A947-70E740481C1C}">
+                          <a14:useLocalDpi xmlns:a14="http://schemas.microsoft.com/office/drawing/2010/main" val="0"/>
+                        </a:ext>
+                      </a:extLst>
+                    </a:blip>
+                    <a:srcRect/>
+                    <a:stretch>
+                      <a:fillRect/>
+                    </a:stretch>
+                  </pic:blipFill>
+                  <pic:spPr bwMode="auto">
+                    <a:xfrm>
+                      <a:off x="0" y="0"/>
+                      <a:ext cx="1762403" cy="3822192"/>
+                    </a:xfrm>
+                    <a:prstGeom prst="rect">
+                      <a:avLst/>
+                    </a:prstGeom>
+                    <a:noFill/>
+                    <a:ln>
+                      <a:noFill/>
+                    </a:ln>
+                  </pic:spPr>
+                </pic:pic>
+              </a:graphicData>
+            </a:graphic>
+          </wp:anchor>
+        </w:drawing>
+      </w:r>
+      <w:r>
+        <w:rPr>
+          <w:noProof/>
+        </w:rPr>
+        <w:drawing>
+          <wp:anchor distT="0" distB="0" distL="114300" distR="114300" simplePos="0" relativeHeight="251681792" behindDoc="0" locked="0" layoutInCell="1" allowOverlap="1" wp14:anchorId="7AF99EDC" wp14:editId="05F160E1">
+            <wp:simplePos x="0" y="0"/>
+            <wp:positionH relativeFrom="margin">
+              <wp:posOffset>-201295</wp:posOffset>
+            </wp:positionH>
+            <wp:positionV relativeFrom="paragraph">
+              <wp:posOffset>287020</wp:posOffset>
+            </wp:positionV>
+            <wp:extent cx="1762125" cy="3822065"/>
+            <wp:effectExtent l="0" t="0" r="9525" b="6985"/>
+            <wp:wrapTopAndBottom/>
+            <wp:docPr id="18" name="Picture 18"/>
+            <wp:cNvGraphicFramePr>
+              <a:graphicFrameLocks xmlns:a="http://schemas.openxmlformats.org/drawingml/2006/main" noChangeAspect="1"/>
+            </wp:cNvGraphicFramePr>
+            <a:graphic xmlns:a="http://schemas.openxmlformats.org/drawingml/2006/main">
+              <a:graphicData uri="http://schemas.openxmlformats.org/drawingml/2006/picture">
+                <pic:pic xmlns:pic="http://schemas.openxmlformats.org/drawingml/2006/picture">
+                  <pic:nvPicPr>
+                    <pic:cNvPr id="0" name="Picture 31"/>
+                    <pic:cNvPicPr>
+                      <a:picLocks noChangeAspect="1" noChangeArrowheads="1"/>
+                    </pic:cNvPicPr>
+                  </pic:nvPicPr>
+                  <pic:blipFill>
+                    <a:blip r:embed="rId13" cstate="print">
+                      <a:extLst>
+                        <a:ext uri="{28A0092B-C50C-407E-A947-70E740481C1C}">
+                          <a14:useLocalDpi xmlns:a14="http://schemas.microsoft.com/office/drawing/2010/main" val="0"/>
+                        </a:ext>
+                      </a:extLst>
+                    </a:blip>
+                    <a:srcRect/>
+                    <a:stretch>
+                      <a:fillRect/>
+                    </a:stretch>
+                  </pic:blipFill>
+                  <pic:spPr bwMode="auto">
+                    <a:xfrm>
+                      <a:off x="0" y="0"/>
+                      <a:ext cx="1762125" cy="3822065"/>
+                    </a:xfrm>
+                    <a:prstGeom prst="rect">
+                      <a:avLst/>
+                    </a:prstGeom>
+                    <a:noFill/>
+                    <a:ln>
+                      <a:noFill/>
+                    </a:ln>
+                  </pic:spPr>
+                </pic:pic>
+              </a:graphicData>
+            </a:graphic>
+          </wp:anchor>
+        </w:drawing>
+      </w:r>
+      <w:r>
+        <w:rPr>
+          <w:noProof/>
+        </w:rPr>
+        <w:drawing>
+          <wp:anchor distT="0" distB="0" distL="114300" distR="114300" simplePos="0" relativeHeight="251680768" behindDoc="0" locked="0" layoutInCell="1" allowOverlap="1" wp14:anchorId="70229D4E" wp14:editId="181E5C86">
+            <wp:simplePos x="0" y="0"/>
+            <wp:positionH relativeFrom="column">
+              <wp:posOffset>1691640</wp:posOffset>
+            </wp:positionH>
+            <wp:positionV relativeFrom="paragraph">
+              <wp:posOffset>284480</wp:posOffset>
+            </wp:positionV>
+            <wp:extent cx="1762125" cy="3822065"/>
+            <wp:effectExtent l="0" t="0" r="9525" b="6985"/>
+            <wp:wrapTopAndBottom/>
+            <wp:docPr id="19" name="Picture 19"/>
+            <wp:cNvGraphicFramePr>
+              <a:graphicFrameLocks xmlns:a="http://schemas.openxmlformats.org/drawingml/2006/main" noChangeAspect="1"/>
+            </wp:cNvGraphicFramePr>
+            <a:graphic xmlns:a="http://schemas.openxmlformats.org/drawingml/2006/main">
+              <a:graphicData uri="http://schemas.openxmlformats.org/drawingml/2006/picture">
+                <pic:pic xmlns:pic="http://schemas.openxmlformats.org/drawingml/2006/picture">
+                  <pic:nvPicPr>
+                    <pic:cNvPr id="0" name="Picture 32"/>
+                    <pic:cNvPicPr>
+                      <a:picLocks noChangeAspect="1" noChangeArrowheads="1"/>
+                    </pic:cNvPicPr>
+                  </pic:nvPicPr>
+                  <pic:blipFill>
+                    <a:blip r:embed="rId14" cstate="print">
+                      <a:extLst>
+                        <a:ext uri="{28A0092B-C50C-407E-A947-70E740481C1C}">
+                          <a14:useLocalDpi xmlns:a14="http://schemas.microsoft.com/office/drawing/2010/main" val="0"/>
+                        </a:ext>
+                      </a:extLst>
+                    </a:blip>
+                    <a:srcRect/>
+                    <a:stretch>
+                      <a:fillRect/>
+                    </a:stretch>
+                  </pic:blipFill>
+                  <pic:spPr bwMode="auto">
+                    <a:xfrm>
+                      <a:off x="0" y="0"/>
+                      <a:ext cx="1762125" cy="3822065"/>
+                    </a:xfrm>
+                    <a:prstGeom prst="rect">
+                      <a:avLst/>
+                    </a:prstGeom>
+                    <a:noFill/>
+                    <a:ln>
+                      <a:noFill/>
+                    </a:ln>
+                  </pic:spPr>
+                </pic:pic>
+              </a:graphicData>
+            </a:graphic>
+          </wp:anchor>
+        </w:drawing>
+      </w:r>
+      <w:r>
+        <w:rPr>
+          <w:noProof/>
+        </w:rPr>
+        <w:drawing>
+          <wp:anchor distT="0" distB="0" distL="114300" distR="114300" simplePos="0" relativeHeight="251678720" behindDoc="0" locked="0" layoutInCell="1" allowOverlap="1" wp14:anchorId="342806A2" wp14:editId="5FD050C7">
+            <wp:simplePos x="0" y="0"/>
+            <wp:positionH relativeFrom="column">
+              <wp:posOffset>3594735</wp:posOffset>
+            </wp:positionH>
+            <wp:positionV relativeFrom="paragraph">
+              <wp:posOffset>287020</wp:posOffset>
+            </wp:positionV>
+            <wp:extent cx="1762125" cy="3822065"/>
+            <wp:effectExtent l="0" t="0" r="9525" b="6985"/>
+            <wp:wrapTopAndBottom/>
+            <wp:docPr id="21" name="Picture 21"/>
+            <wp:cNvGraphicFramePr>
+              <a:graphicFrameLocks xmlns:a="http://schemas.openxmlformats.org/drawingml/2006/main" noChangeAspect="1"/>
+            </wp:cNvGraphicFramePr>
+            <a:graphic xmlns:a="http://schemas.openxmlformats.org/drawingml/2006/main">
+              <a:graphicData uri="http://schemas.openxmlformats.org/drawingml/2006/picture">
+                <pic:pic xmlns:pic="http://schemas.openxmlformats.org/drawingml/2006/picture">
+                  <pic:nvPicPr>
+                    <pic:cNvPr id="0" name="Picture 34"/>
+                    <pic:cNvPicPr>
+                      <a:picLocks noChangeAspect="1" noChangeArrowheads="1"/>
+                    </pic:cNvPicPr>
+                  </pic:nvPicPr>
+                  <pic:blipFill>
+                    <a:blip r:embed="rId15" cstate="print">
+                      <a:extLst>
+                        <a:ext uri="{28A0092B-C50C-407E-A947-70E740481C1C}">
+                          <a14:useLocalDpi xmlns:a14="http://schemas.microsoft.com/office/drawing/2010/main" val="0"/>
+                        </a:ext>
+                      </a:extLst>
+                    </a:blip>
+                    <a:srcRect/>
+                    <a:stretch>
+                      <a:fillRect/>
+                    </a:stretch>
+                  </pic:blipFill>
+                  <pic:spPr bwMode="auto">
+                    <a:xfrm>
+                      <a:off x="0" y="0"/>
+                      <a:ext cx="1762125" cy="3822065"/>
+                    </a:xfrm>
+                    <a:prstGeom prst="rect">
+                      <a:avLst/>
+                    </a:prstGeom>
+                    <a:noFill/>
+                    <a:ln>
+                      <a:noFill/>
+                    </a:ln>
+                  </pic:spPr>
+                </pic:pic>
+              </a:graphicData>
+            </a:graphic>
+          </wp:anchor>
+        </w:drawing>
+      </w:r>
+    </w:p>
+    <w:p>
+      <w:pPr>
+        <w:jc w:val="both"/>
         <w:rPr>
           <w:rFonts w:ascii="Calibri" w:hAnsi="Calibri" w:cs="Calibri"/>
           <w:sz w:val="22"/>
           <w:szCs w:val="22"/>
           <w:lang w:eastAsia="en-US"/>
         </w:rPr>
-        <w:t xml:space="preserve"> questions and one input.</w:t>
-      </w:r>
+      </w:pPr>
+    </w:p>
+    <w:p>
+      <w:pPr>
+        <w:jc w:val="both"/>
+        <w:rPr>
+          <w:rFonts w:ascii="Calibri" w:hAnsi="Calibri" w:cs="Calibri"/>
+          <w:sz w:val="22"/>
+          <w:szCs w:val="22"/>
+          <w:lang w:eastAsia="en-US"/>
+        </w:rPr>
+      </w:pPr>
     </w:p>
     <w:p>
       <w:pPr>
@@ -6113,60 +6620,6 @@
         </w:rPr>
         <w:t>All findings were turned into requirements and ranked based on the High/Medium ratings determined from Assessment 2. The full matrix, including decisions, principles, and WCAG criteria, is presented in Appendix A.</w:t>
       </w:r>
-    </w:p>
-    <w:p>
-      <w:pPr>
-        <w:jc w:val="both"/>
-        <w:rPr>
-          <w:rFonts w:ascii="Calibri" w:hAnsi="Calibri" w:cs="Calibri"/>
-          <w:lang w:eastAsia="en-US"/>
-        </w:rPr>
-      </w:pPr>
-    </w:p>
-    <w:p>
-      <w:pPr>
-        <w:jc w:val="both"/>
-        <w:rPr>
-          <w:rFonts w:ascii="Calibri" w:hAnsi="Calibri" w:cs="Calibri"/>
-          <w:lang w:eastAsia="en-US"/>
-        </w:rPr>
-      </w:pPr>
-    </w:p>
-    <w:p>
-      <w:pPr>
-        <w:jc w:val="both"/>
-        <w:rPr>
-          <w:rFonts w:ascii="Calibri" w:hAnsi="Calibri" w:cs="Calibri"/>
-          <w:lang w:eastAsia="en-US"/>
-        </w:rPr>
-      </w:pPr>
-    </w:p>
-    <w:p>
-      <w:pPr>
-        <w:jc w:val="both"/>
-        <w:rPr>
-          <w:rFonts w:ascii="Calibri" w:hAnsi="Calibri" w:cs="Calibri"/>
-          <w:lang w:eastAsia="en-US"/>
-        </w:rPr>
-      </w:pPr>
-    </w:p>
-    <w:p>
-      <w:pPr>
-        <w:jc w:val="both"/>
-        <w:rPr>
-          <w:rFonts w:ascii="Calibri" w:hAnsi="Calibri" w:cs="Calibri"/>
-          <w:lang w:eastAsia="en-US"/>
-        </w:rPr>
-      </w:pPr>
-    </w:p>
-    <w:p>
-      <w:pPr>
-        <w:jc w:val="both"/>
-        <w:rPr>
-          <w:rFonts w:ascii="Calibri" w:hAnsi="Calibri" w:cs="Calibri"/>
-          <w:lang w:eastAsia="en-US"/>
-        </w:rPr>
-      </w:pPr>
     </w:p>
     <w:tbl>
       <w:tblPr>
@@ -6204,7 +6657,6 @@
                 <w:sz w:val="22"/>
                 <w:szCs w:val="22"/>
               </w:rPr>
-              <w:lastRenderedPageBreak/>
               <w:t>ID</w:t>
             </w:r>
           </w:p>
@@ -6350,23 +6802,13 @@
                 <w:szCs w:val="22"/>
               </w:rPr>
             </w:pPr>
-            <w:proofErr w:type="gramStart"/>
-            <w:r>
-              <w:rPr>
-                <w:rFonts w:ascii="Calibri" w:eastAsia="Calibri" w:hAnsi="Calibri" w:cs="Calibri"/>
-                <w:sz w:val="22"/>
-                <w:szCs w:val="22"/>
-              </w:rPr>
-              <w:t>Obvious</w:t>
-            </w:r>
-            <w:proofErr w:type="gramEnd"/>
-            <w:r>
-              <w:rPr>
-                <w:rFonts w:ascii="Calibri" w:eastAsia="Calibri" w:hAnsi="Calibri" w:cs="Calibri"/>
-                <w:sz w:val="22"/>
-                <w:szCs w:val="22"/>
-              </w:rPr>
-              <w:t>, labelled entry point to Buy.</w:t>
+            <w:r>
+              <w:rPr>
+                <w:rFonts w:ascii="Calibri" w:eastAsia="Calibri" w:hAnsi="Calibri" w:cs="Calibri"/>
+                <w:sz w:val="22"/>
+                <w:szCs w:val="22"/>
+              </w:rPr>
+              <w:t>Obvious, labelled entry point to Buy.</w:t>
             </w:r>
           </w:p>
         </w:tc>
@@ -7781,19 +8223,7 @@
         <w:rPr>
           <w:rFonts w:cs="Calibri"/>
         </w:rPr>
-        <w:t>2.</w:t>
-      </w:r>
-      <w:r>
-        <w:rPr>
-          <w:rFonts w:cs="Calibri"/>
-        </w:rPr>
-        <w:t>4</w:t>
-      </w:r>
-      <w:r>
-        <w:rPr>
-          <w:rFonts w:cs="Calibri"/>
-        </w:rPr>
-        <w:t xml:space="preserve"> </w:t>
+        <w:t xml:space="preserve">2.4 </w:t>
       </w:r>
       <w:r>
         <w:rPr>
@@ -7895,7 +8325,7 @@
           <w:szCs w:val="22"/>
           <w:lang w:eastAsia="en-US"/>
         </w:rPr>
-        <w:t>. The important decisions include same three steps for Buy and Sell, home screen as search &gt; balance &gt; actions &gt; watchlist &gt; “More,” and the presence of a help icon in every header. The second iteration yielded the high-fidelity screens with the dark theme shown in Section 4 as well as the Figma prototype</w:t>
+        <w:t xml:space="preserve">. The important decisions include same three steps for Buy and Sell, home screen as search &gt; balance &gt; actions &gt; watchlist &gt; “More,” and the presence of a help icon in every header. The second iteration yielded the high-fidelity screens with the dark theme shown in Section 4 as well </w:t>
       </w:r>
       <w:r>
         <w:rPr>
@@ -7904,7 +8334,8 @@
           <w:szCs w:val="22"/>
           <w:lang w:eastAsia="en-US"/>
         </w:rPr>
-        <w:t>,</w:t>
+        <w:lastRenderedPageBreak/>
+        <w:t>as the Figma prototype</w:t>
       </w:r>
       <w:r>
         <w:rPr>
@@ -7913,7 +8344,414 @@
           <w:szCs w:val="22"/>
           <w:lang w:eastAsia="en-US"/>
         </w:rPr>
-        <w:t xml:space="preserve"> the dark theme was retained since the user already knows it and it reduces the relearning cost.</w:t>
+        <w:t>,</w:t>
+      </w:r>
+      <w:r>
+        <w:rPr>
+          <w:rFonts w:ascii="Calibri" w:hAnsi="Calibri" w:cs="Calibri"/>
+          <w:sz w:val="22"/>
+          <w:szCs w:val="22"/>
+          <w:lang w:eastAsia="en-US"/>
+        </w:rPr>
+        <w:t xml:space="preserve"> the dark theme was retained since the user already knows it and it reduces </w:t>
+      </w:r>
+      <w:r>
+        <w:rPr>
+          <w:noProof/>
+        </w:rPr>
+        <w:drawing>
+          <wp:anchor distT="0" distB="0" distL="114300" distR="114300" simplePos="0" relativeHeight="251664384" behindDoc="0" locked="0" layoutInCell="1" allowOverlap="1" wp14:anchorId="136EF6AE" wp14:editId="68822C25">
+            <wp:simplePos x="0" y="0"/>
+            <wp:positionH relativeFrom="margin">
+              <wp:posOffset>0</wp:posOffset>
+            </wp:positionH>
+            <wp:positionV relativeFrom="paragraph">
+              <wp:posOffset>4450080</wp:posOffset>
+            </wp:positionV>
+            <wp:extent cx="1764030" cy="3822065"/>
+            <wp:effectExtent l="0" t="0" r="7620" b="6985"/>
+            <wp:wrapTopAndBottom/>
+            <wp:docPr id="6" name="Picture 6"/>
+            <wp:cNvGraphicFramePr>
+              <a:graphicFrameLocks xmlns:a="http://schemas.openxmlformats.org/drawingml/2006/main" noChangeAspect="1"/>
+            </wp:cNvGraphicFramePr>
+            <a:graphic xmlns:a="http://schemas.openxmlformats.org/drawingml/2006/main">
+              <a:graphicData uri="http://schemas.openxmlformats.org/drawingml/2006/picture">
+                <pic:pic xmlns:pic="http://schemas.openxmlformats.org/drawingml/2006/picture">
+                  <pic:nvPicPr>
+                    <pic:cNvPr id="0" name="Picture 8"/>
+                    <pic:cNvPicPr>
+                      <a:picLocks noChangeAspect="1" noChangeArrowheads="1"/>
+                    </pic:cNvPicPr>
+                  </pic:nvPicPr>
+                  <pic:blipFill>
+                    <a:blip r:embed="rId16">
+                      <a:extLst>
+                        <a:ext uri="{28A0092B-C50C-407E-A947-70E740481C1C}">
+                          <a14:useLocalDpi xmlns:a14="http://schemas.microsoft.com/office/drawing/2010/main" val="0"/>
+                        </a:ext>
+                      </a:extLst>
+                    </a:blip>
+                    <a:srcRect/>
+                    <a:stretch>
+                      <a:fillRect/>
+                    </a:stretch>
+                  </pic:blipFill>
+                  <pic:spPr bwMode="auto">
+                    <a:xfrm>
+                      <a:off x="0" y="0"/>
+                      <a:ext cx="1764030" cy="3822065"/>
+                    </a:xfrm>
+                    <a:prstGeom prst="rect">
+                      <a:avLst/>
+                    </a:prstGeom>
+                    <a:noFill/>
+                    <a:ln>
+                      <a:noFill/>
+                    </a:ln>
+                  </pic:spPr>
+                </pic:pic>
+              </a:graphicData>
+            </a:graphic>
+          </wp:anchor>
+        </w:drawing>
+      </w:r>
+      <w:r>
+        <w:rPr>
+          <w:noProof/>
+        </w:rPr>
+        <w:drawing>
+          <wp:anchor distT="0" distB="0" distL="114300" distR="114300" simplePos="0" relativeHeight="251665408" behindDoc="0" locked="0" layoutInCell="1" allowOverlap="1" wp14:anchorId="22FA31E0" wp14:editId="0249E927">
+            <wp:simplePos x="0" y="0"/>
+            <wp:positionH relativeFrom="margin">
+              <wp:posOffset>3773170</wp:posOffset>
+            </wp:positionH>
+            <wp:positionV relativeFrom="paragraph">
+              <wp:posOffset>4451350</wp:posOffset>
+            </wp:positionV>
+            <wp:extent cx="1764030" cy="3822065"/>
+            <wp:effectExtent l="0" t="0" r="7620" b="6985"/>
+            <wp:wrapTopAndBottom/>
+            <wp:docPr id="5" name="Picture 5"/>
+            <wp:cNvGraphicFramePr>
+              <a:graphicFrameLocks xmlns:a="http://schemas.openxmlformats.org/drawingml/2006/main" noChangeAspect="1"/>
+            </wp:cNvGraphicFramePr>
+            <a:graphic xmlns:a="http://schemas.openxmlformats.org/drawingml/2006/main">
+              <a:graphicData uri="http://schemas.openxmlformats.org/drawingml/2006/picture">
+                <pic:pic xmlns:pic="http://schemas.openxmlformats.org/drawingml/2006/picture">
+                  <pic:nvPicPr>
+                    <pic:cNvPr id="0" name="Picture 7"/>
+                    <pic:cNvPicPr>
+                      <a:picLocks noChangeAspect="1" noChangeArrowheads="1"/>
+                    </pic:cNvPicPr>
+                  </pic:nvPicPr>
+                  <pic:blipFill>
+                    <a:blip r:embed="rId17">
+                      <a:extLst>
+                        <a:ext uri="{28A0092B-C50C-407E-A947-70E740481C1C}">
+                          <a14:useLocalDpi xmlns:a14="http://schemas.microsoft.com/office/drawing/2010/main" val="0"/>
+                        </a:ext>
+                      </a:extLst>
+                    </a:blip>
+                    <a:srcRect/>
+                    <a:stretch>
+                      <a:fillRect/>
+                    </a:stretch>
+                  </pic:blipFill>
+                  <pic:spPr bwMode="auto">
+                    <a:xfrm>
+                      <a:off x="0" y="0"/>
+                      <a:ext cx="1764030" cy="3822065"/>
+                    </a:xfrm>
+                    <a:prstGeom prst="rect">
+                      <a:avLst/>
+                    </a:prstGeom>
+                    <a:noFill/>
+                    <a:ln>
+                      <a:noFill/>
+                    </a:ln>
+                  </pic:spPr>
+                </pic:pic>
+              </a:graphicData>
+            </a:graphic>
+          </wp:anchor>
+        </w:drawing>
+      </w:r>
+      <w:r>
+        <w:rPr>
+          <w:noProof/>
+        </w:rPr>
+        <w:drawing>
+          <wp:anchor distT="0" distB="0" distL="114300" distR="114300" simplePos="0" relativeHeight="251663360" behindDoc="0" locked="0" layoutInCell="1" allowOverlap="1" wp14:anchorId="489190DB" wp14:editId="0A96A3F7">
+            <wp:simplePos x="0" y="0"/>
+            <wp:positionH relativeFrom="margin">
+              <wp:posOffset>1874520</wp:posOffset>
+            </wp:positionH>
+            <wp:positionV relativeFrom="paragraph">
+              <wp:posOffset>4450617</wp:posOffset>
+            </wp:positionV>
+            <wp:extent cx="1764030" cy="3822065"/>
+            <wp:effectExtent l="0" t="0" r="7620" b="6985"/>
+            <wp:wrapTopAndBottom/>
+            <wp:docPr id="8" name="Picture 8"/>
+            <wp:cNvGraphicFramePr>
+              <a:graphicFrameLocks xmlns:a="http://schemas.openxmlformats.org/drawingml/2006/main" noChangeAspect="1"/>
+            </wp:cNvGraphicFramePr>
+            <a:graphic xmlns:a="http://schemas.openxmlformats.org/drawingml/2006/main">
+              <a:graphicData uri="http://schemas.openxmlformats.org/drawingml/2006/picture">
+                <pic:pic xmlns:pic="http://schemas.openxmlformats.org/drawingml/2006/picture">
+                  <pic:nvPicPr>
+                    <pic:cNvPr id="0" name="Picture 9"/>
+                    <pic:cNvPicPr>
+                      <a:picLocks noChangeAspect="1" noChangeArrowheads="1"/>
+                    </pic:cNvPicPr>
+                  </pic:nvPicPr>
+                  <pic:blipFill>
+                    <a:blip r:embed="rId18">
+                      <a:extLst>
+                        <a:ext uri="{28A0092B-C50C-407E-A947-70E740481C1C}">
+                          <a14:useLocalDpi xmlns:a14="http://schemas.microsoft.com/office/drawing/2010/main" val="0"/>
+                        </a:ext>
+                      </a:extLst>
+                    </a:blip>
+                    <a:srcRect/>
+                    <a:stretch>
+                      <a:fillRect/>
+                    </a:stretch>
+                  </pic:blipFill>
+                  <pic:spPr bwMode="auto">
+                    <a:xfrm>
+                      <a:off x="0" y="0"/>
+                      <a:ext cx="1764030" cy="3822065"/>
+                    </a:xfrm>
+                    <a:prstGeom prst="rect">
+                      <a:avLst/>
+                    </a:prstGeom>
+                    <a:noFill/>
+                    <a:ln>
+                      <a:noFill/>
+                    </a:ln>
+                  </pic:spPr>
+                </pic:pic>
+              </a:graphicData>
+            </a:graphic>
+          </wp:anchor>
+        </w:drawing>
+      </w:r>
+      <w:r>
+        <w:rPr>
+          <w:rFonts w:ascii="Calibri" w:hAnsi="Calibri" w:cs="Calibri"/>
+          <w:sz w:val="22"/>
+          <w:szCs w:val="22"/>
+          <w:lang w:eastAsia="en-US"/>
+        </w:rPr>
+        <w:t>the relearning cost.</w:t>
+      </w:r>
+    </w:p>
+    <w:p>
+      <w:pPr>
+        <w:jc w:val="both"/>
+        <w:rPr>
+          <w:rFonts w:ascii="Calibri" w:hAnsi="Calibri" w:cs="Calibri"/>
+          <w:sz w:val="22"/>
+          <w:szCs w:val="22"/>
+          <w:lang w:eastAsia="en-US"/>
+        </w:rPr>
+      </w:pPr>
+      <w:r>
+        <w:rPr>
+          <w:noProof/>
+        </w:rPr>
+        <w:drawing>
+          <wp:anchor distT="0" distB="0" distL="114300" distR="114300" simplePos="0" relativeHeight="251662336" behindDoc="0" locked="0" layoutInCell="1" allowOverlap="1" wp14:anchorId="3E4FC962" wp14:editId="6A20BAD9">
+            <wp:simplePos x="0" y="0"/>
+            <wp:positionH relativeFrom="column">
+              <wp:posOffset>3769995</wp:posOffset>
+            </wp:positionH>
+            <wp:positionV relativeFrom="paragraph">
+              <wp:posOffset>0</wp:posOffset>
+            </wp:positionV>
+            <wp:extent cx="1763773" cy="3822192"/>
+            <wp:effectExtent l="0" t="0" r="8255" b="6985"/>
+            <wp:wrapTopAndBottom/>
+            <wp:docPr id="4" name="Picture 4"/>
+            <wp:cNvGraphicFramePr>
+              <a:graphicFrameLocks xmlns:a="http://schemas.openxmlformats.org/drawingml/2006/main" noChangeAspect="1"/>
+            </wp:cNvGraphicFramePr>
+            <a:graphic xmlns:a="http://schemas.openxmlformats.org/drawingml/2006/main">
+              <a:graphicData uri="http://schemas.openxmlformats.org/drawingml/2006/picture">
+                <pic:pic xmlns:pic="http://schemas.openxmlformats.org/drawingml/2006/picture">
+                  <pic:nvPicPr>
+                    <pic:cNvPr id="0" name="Picture 5"/>
+                    <pic:cNvPicPr>
+                      <a:picLocks noChangeAspect="1" noChangeArrowheads="1"/>
+                    </pic:cNvPicPr>
+                  </pic:nvPicPr>
+                  <pic:blipFill>
+                    <a:blip r:embed="rId19">
+                      <a:extLst>
+                        <a:ext uri="{28A0092B-C50C-407E-A947-70E740481C1C}">
+                          <a14:useLocalDpi xmlns:a14="http://schemas.microsoft.com/office/drawing/2010/main" val="0"/>
+                        </a:ext>
+                      </a:extLst>
+                    </a:blip>
+                    <a:srcRect/>
+                    <a:stretch>
+                      <a:fillRect/>
+                    </a:stretch>
+                  </pic:blipFill>
+                  <pic:spPr bwMode="auto">
+                    <a:xfrm>
+                      <a:off x="0" y="0"/>
+                      <a:ext cx="1763773" cy="3822192"/>
+                    </a:xfrm>
+                    <a:prstGeom prst="rect">
+                      <a:avLst/>
+                    </a:prstGeom>
+                    <a:noFill/>
+                    <a:ln>
+                      <a:noFill/>
+                    </a:ln>
+                  </pic:spPr>
+                </pic:pic>
+              </a:graphicData>
+            </a:graphic>
+            <wp14:sizeRelH relativeFrom="margin">
+              <wp14:pctWidth>0</wp14:pctWidth>
+            </wp14:sizeRelH>
+            <wp14:sizeRelV relativeFrom="margin">
+              <wp14:pctHeight>0</wp14:pctHeight>
+            </wp14:sizeRelV>
+          </wp:anchor>
+        </w:drawing>
+      </w:r>
+      <w:r>
+        <w:rPr>
+          <w:noProof/>
+        </w:rPr>
+        <w:drawing>
+          <wp:anchor distT="0" distB="0" distL="114300" distR="114300" simplePos="0" relativeHeight="251661312" behindDoc="0" locked="0" layoutInCell="1" allowOverlap="1" wp14:anchorId="4888FD2C" wp14:editId="3E1FEF00">
+            <wp:simplePos x="0" y="0"/>
+            <wp:positionH relativeFrom="margin">
+              <wp:posOffset>1889760</wp:posOffset>
+            </wp:positionH>
+            <wp:positionV relativeFrom="paragraph">
+              <wp:posOffset>0</wp:posOffset>
+            </wp:positionV>
+            <wp:extent cx="1764320" cy="3822192"/>
+            <wp:effectExtent l="0" t="0" r="7620" b="6985"/>
+            <wp:wrapTopAndBottom/>
+            <wp:docPr id="2" name="Picture 2"/>
+            <wp:cNvGraphicFramePr>
+              <a:graphicFrameLocks xmlns:a="http://schemas.openxmlformats.org/drawingml/2006/main" noChangeAspect="1"/>
+            </wp:cNvGraphicFramePr>
+            <a:graphic xmlns:a="http://schemas.openxmlformats.org/drawingml/2006/main">
+              <a:graphicData uri="http://schemas.openxmlformats.org/drawingml/2006/picture">
+                <pic:pic xmlns:pic="http://schemas.openxmlformats.org/drawingml/2006/picture">
+                  <pic:nvPicPr>
+                    <pic:cNvPr id="0" name="Picture 3"/>
+                    <pic:cNvPicPr>
+                      <a:picLocks noChangeAspect="1" noChangeArrowheads="1"/>
+                    </pic:cNvPicPr>
+                  </pic:nvPicPr>
+                  <pic:blipFill>
+                    <a:blip r:embed="rId20">
+                      <a:extLst>
+                        <a:ext uri="{28A0092B-C50C-407E-A947-70E740481C1C}">
+                          <a14:useLocalDpi xmlns:a14="http://schemas.microsoft.com/office/drawing/2010/main" val="0"/>
+                        </a:ext>
+                      </a:extLst>
+                    </a:blip>
+                    <a:srcRect/>
+                    <a:stretch>
+                      <a:fillRect/>
+                    </a:stretch>
+                  </pic:blipFill>
+                  <pic:spPr bwMode="auto">
+                    <a:xfrm>
+                      <a:off x="0" y="0"/>
+                      <a:ext cx="1764320" cy="3822192"/>
+                    </a:xfrm>
+                    <a:prstGeom prst="rect">
+                      <a:avLst/>
+                    </a:prstGeom>
+                    <a:noFill/>
+                    <a:ln>
+                      <a:noFill/>
+                    </a:ln>
+                  </pic:spPr>
+                </pic:pic>
+              </a:graphicData>
+            </a:graphic>
+            <wp14:sizeRelH relativeFrom="margin">
+              <wp14:pctWidth>0</wp14:pctWidth>
+            </wp14:sizeRelH>
+            <wp14:sizeRelV relativeFrom="margin">
+              <wp14:pctHeight>0</wp14:pctHeight>
+            </wp14:sizeRelV>
+          </wp:anchor>
+        </w:drawing>
+      </w:r>
+      <w:r>
+        <w:rPr>
+          <w:noProof/>
+        </w:rPr>
+        <w:drawing>
+          <wp:anchor distT="0" distB="0" distL="114300" distR="114300" simplePos="0" relativeHeight="251660288" behindDoc="0" locked="0" layoutInCell="1" allowOverlap="1" wp14:anchorId="0730FE0B" wp14:editId="170F398F">
+            <wp:simplePos x="0" y="0"/>
+            <wp:positionH relativeFrom="margin">
+              <wp:posOffset>0</wp:posOffset>
+            </wp:positionH>
+            <wp:positionV relativeFrom="paragraph">
+              <wp:posOffset>0</wp:posOffset>
+            </wp:positionV>
+            <wp:extent cx="1764856" cy="3822166"/>
+            <wp:effectExtent l="0" t="0" r="6985" b="6985"/>
+            <wp:wrapTopAndBottom/>
+            <wp:docPr id="1" name="Picture 1"/>
+            <wp:cNvGraphicFramePr>
+              <a:graphicFrameLocks xmlns:a="http://schemas.openxmlformats.org/drawingml/2006/main" noChangeAspect="1"/>
+            </wp:cNvGraphicFramePr>
+            <a:graphic xmlns:a="http://schemas.openxmlformats.org/drawingml/2006/main">
+              <a:graphicData uri="http://schemas.openxmlformats.org/drawingml/2006/picture">
+                <pic:pic xmlns:pic="http://schemas.openxmlformats.org/drawingml/2006/picture">
+                  <pic:nvPicPr>
+                    <pic:cNvPr id="0" name="Picture 1"/>
+                    <pic:cNvPicPr>
+                      <a:picLocks noChangeAspect="1" noChangeArrowheads="1"/>
+                    </pic:cNvPicPr>
+                  </pic:nvPicPr>
+                  <pic:blipFill>
+                    <a:blip r:embed="rId21">
+                      <a:extLst>
+                        <a:ext uri="{28A0092B-C50C-407E-A947-70E740481C1C}">
+                          <a14:useLocalDpi xmlns:a14="http://schemas.microsoft.com/office/drawing/2010/main" val="0"/>
+                        </a:ext>
+                      </a:extLst>
+                    </a:blip>
+                    <a:srcRect/>
+                    <a:stretch>
+                      <a:fillRect/>
+                    </a:stretch>
+                  </pic:blipFill>
+                  <pic:spPr bwMode="auto">
+                    <a:xfrm>
+                      <a:off x="0" y="0"/>
+                      <a:ext cx="1764856" cy="3822166"/>
+                    </a:xfrm>
+                    <a:prstGeom prst="rect">
+                      <a:avLst/>
+                    </a:prstGeom>
+                    <a:noFill/>
+                    <a:ln>
+                      <a:noFill/>
+                    </a:ln>
+                  </pic:spPr>
+                </pic:pic>
+              </a:graphicData>
+            </a:graphic>
+          </wp:anchor>
+        </w:drawing>
       </w:r>
     </w:p>
     <w:p>
@@ -7978,32 +8816,9 @@
           <w:sz w:val="20"/>
           <w:szCs w:val="20"/>
         </w:rPr>
-        <w:t xml:space="preserve"> </w:t>
-      </w:r>
-      <w:r>
-        <w:rPr>
-          <w:rFonts w:ascii="Calibri" w:eastAsia="Calibri" w:hAnsi="Calibri" w:cs="Calibri"/>
-          <w:color w:val="404040"/>
-          <w:sz w:val="20"/>
-          <w:szCs w:val="20"/>
-        </w:rPr>
-        <w:t>Iteration 1 low-fidelity wireframes</w:t>
+        <w:t xml:space="preserve"> Iteration 1 low-fidelity wireframes</w:t>
       </w:r>
       <w:bookmarkEnd w:id="11"/>
-    </w:p>
-    <w:p>
-      <w:pPr>
-        <w:rPr>
-          <w:rFonts w:ascii="Calibri" w:hAnsi="Calibri" w:cs="Calibri"/>
-        </w:rPr>
-      </w:pPr>
-    </w:p>
-    <w:p>
-      <w:pPr>
-        <w:rPr>
-          <w:rFonts w:ascii="Calibri" w:hAnsi="Calibri" w:cs="Calibri"/>
-        </w:rPr>
-      </w:pPr>
     </w:p>
     <w:p>
       <w:pPr>
@@ -8199,23 +9014,7 @@
                 <w:sz w:val="22"/>
                 <w:szCs w:val="22"/>
               </w:rPr>
-              <w:t>Settle structure; address R1</w:t>
-            </w:r>
-            <w:r>
-              <w:rPr>
-                <w:rFonts w:ascii="Calibri" w:eastAsia="Calibri" w:hAnsi="Calibri" w:cs="Calibri"/>
-                <w:sz w:val="22"/>
-                <w:szCs w:val="22"/>
-              </w:rPr>
-              <w:t xml:space="preserve"> - </w:t>
-            </w:r>
-            <w:r>
-              <w:rPr>
-                <w:rFonts w:ascii="Calibri" w:eastAsia="Calibri" w:hAnsi="Calibri" w:cs="Calibri"/>
-                <w:sz w:val="22"/>
-                <w:szCs w:val="22"/>
-              </w:rPr>
-              <w:t>R8.</w:t>
+              <w:t>Settle structure; address R1 - R8.</w:t>
             </w:r>
           </w:p>
         </w:tc>
@@ -8315,23 +9114,7 @@
                 <w:sz w:val="22"/>
                 <w:szCs w:val="22"/>
               </w:rPr>
-              <w:t>Hierarchy, consistency, R9</w:t>
-            </w:r>
-            <w:r>
-              <w:rPr>
-                <w:rFonts w:ascii="Calibri" w:eastAsia="Calibri" w:hAnsi="Calibri" w:cs="Calibri"/>
-                <w:sz w:val="22"/>
-                <w:szCs w:val="22"/>
-              </w:rPr>
-              <w:t xml:space="preserve"> - </w:t>
-            </w:r>
-            <w:r>
-              <w:rPr>
-                <w:rFonts w:ascii="Calibri" w:eastAsia="Calibri" w:hAnsi="Calibri" w:cs="Calibri"/>
-                <w:sz w:val="22"/>
-                <w:szCs w:val="22"/>
-              </w:rPr>
-              <w:t>R14.</w:t>
+              <w:t>Hierarchy, consistency, R9 - R14.</w:t>
             </w:r>
           </w:p>
         </w:tc>
@@ -8355,23 +9138,7 @@
                 <w:sz w:val="22"/>
                 <w:szCs w:val="22"/>
               </w:rPr>
-              <w:t>Figures 3</w:t>
-            </w:r>
-            <w:r>
-              <w:rPr>
-                <w:rFonts w:ascii="Calibri" w:eastAsia="Calibri" w:hAnsi="Calibri" w:cs="Calibri"/>
-                <w:sz w:val="22"/>
-                <w:szCs w:val="22"/>
-              </w:rPr>
-              <w:t xml:space="preserve"> -</w:t>
-            </w:r>
-            <w:r>
-              <w:rPr>
-                <w:rFonts w:ascii="Calibri" w:eastAsia="Calibri" w:hAnsi="Calibri" w:cs="Calibri"/>
-                <w:sz w:val="22"/>
-                <w:szCs w:val="22"/>
-              </w:rPr>
-              <w:t>5</w:t>
+              <w:t>Figures 3 -5</w:t>
             </w:r>
           </w:p>
         </w:tc>
@@ -8442,25 +9209,7 @@
                 <w:sz w:val="22"/>
                 <w:szCs w:val="22"/>
               </w:rPr>
-              <w:t xml:space="preserve">value </w:t>
-            </w:r>
-            <w:proofErr w:type="gramStart"/>
-            <w:r>
-              <w:rPr>
-                <w:rFonts w:ascii="Calibri" w:eastAsia="Calibri" w:hAnsi="Calibri" w:cs="Calibri"/>
-                <w:sz w:val="22"/>
-                <w:szCs w:val="22"/>
-              </w:rPr>
-              <w:t>red (#</w:t>
-            </w:r>
-            <w:proofErr w:type="gramEnd"/>
-            <w:r>
-              <w:rPr>
-                <w:rFonts w:ascii="Calibri" w:eastAsia="Calibri" w:hAnsi="Calibri" w:cs="Calibri"/>
-                <w:sz w:val="22"/>
-                <w:szCs w:val="22"/>
-              </w:rPr>
-              <w:t>F6465D) at 4.48:1 on card surfaces, below the 4.5:1 AA minimum; text and the Sell icon changed to #FF6B7D (5.76:1).</w:t>
+              <w:t>value red (#F6465D) at 4.48:1 on card surfaces, below the 4.5:1 AA minimum; text and the Sell icon changed to #FF6B7D (5.76:1).</w:t>
             </w:r>
           </w:p>
         </w:tc>
@@ -8585,19 +9334,7 @@
         <w:rPr>
           <w:rFonts w:cs="Calibri"/>
         </w:rPr>
-        <w:t>2.</w:t>
-      </w:r>
-      <w:r>
-        <w:rPr>
-          <w:rFonts w:cs="Calibri"/>
-        </w:rPr>
-        <w:t>5</w:t>
-      </w:r>
-      <w:r>
-        <w:rPr>
-          <w:rFonts w:cs="Calibri"/>
-        </w:rPr>
-        <w:t xml:space="preserve"> </w:t>
+        <w:t xml:space="preserve">2.5 </w:t>
       </w:r>
       <w:r>
         <w:rPr>
@@ -8642,27 +9379,7 @@
           <w:szCs w:val="22"/>
           <w:lang w:eastAsia="en-US"/>
         </w:rPr>
-        <w:t xml:space="preserve">and </w:t>
-      </w:r>
-      <w:proofErr w:type="gramStart"/>
-      <w:r>
-        <w:rPr>
-          <w:rFonts w:ascii="Calibri" w:hAnsi="Calibri" w:cs="Calibri"/>
-          <w:sz w:val="22"/>
-          <w:szCs w:val="22"/>
-          <w:lang w:eastAsia="en-US"/>
-        </w:rPr>
-        <w:t>Word</w:t>
-      </w:r>
-      <w:proofErr w:type="gramEnd"/>
-      <w:r>
-        <w:rPr>
-          <w:rFonts w:ascii="Calibri" w:hAnsi="Calibri" w:cs="Calibri"/>
-          <w:sz w:val="22"/>
-          <w:szCs w:val="22"/>
-          <w:lang w:eastAsia="en-US"/>
-        </w:rPr>
-        <w:t xml:space="preserve"> for assembling everything together. All the members had their own branches and made pull requests for changes approved by other members; work was done using GitHub Issues. Decisions were taken and documented in the meetings. </w:t>
+        <w:t xml:space="preserve">and Word for assembling everything together. All the members had their own branches and made pull requests for changes approved by other members; work was done using GitHub Issues. Decisions were taken and documented in the meetings. </w:t>
       </w:r>
     </w:p>
     <w:p>
@@ -8684,7 +9401,7 @@
         </w:rPr>
         <w:t xml:space="preserve">Prototype: </w:t>
       </w:r>
-      <w:hyperlink r:id="rId10" w:history="1">
+      <w:hyperlink r:id="rId22" w:history="1">
         <w:r>
           <w:rPr>
             <w:rStyle w:val="Hyperlink"/>
@@ -8716,7 +9433,7 @@
         </w:rPr>
         <w:t xml:space="preserve">Repository: </w:t>
       </w:r>
-      <w:hyperlink r:id="rId11" w:history="1">
+      <w:hyperlink r:id="rId23" w:history="1">
         <w:r>
           <w:rPr>
             <w:rStyle w:val="Hyperlink"/>
@@ -8746,13 +9463,7 @@
         <w:rPr>
           <w:rFonts w:cs="Calibri"/>
         </w:rPr>
-        <w:t xml:space="preserve">Design </w:t>
-      </w:r>
-      <w:r>
-        <w:rPr>
-          <w:rFonts w:cs="Calibri"/>
-        </w:rPr>
-        <w:t>Rationale</w:t>
+        <w:t>Design Rationale</w:t>
       </w:r>
       <w:bookmarkEnd w:id="13"/>
     </w:p>
@@ -8860,27 +9571,7 @@
           <w:szCs w:val="22"/>
           <w:lang w:eastAsia="en-US"/>
         </w:rPr>
-        <w:t xml:space="preserve">, affordance, feedback, and mental </w:t>
-      </w:r>
-      <w:proofErr w:type="gramStart"/>
-      <w:r>
-        <w:rPr>
-          <w:rFonts w:ascii="Calibri" w:hAnsi="Calibri" w:cs="Calibri"/>
-          <w:sz w:val="22"/>
-          <w:szCs w:val="22"/>
-          <w:lang w:eastAsia="en-US"/>
-        </w:rPr>
-        <w:t>models</w:t>
-      </w:r>
-      <w:proofErr w:type="gramEnd"/>
-      <w:r>
-        <w:rPr>
-          <w:rFonts w:ascii="Calibri" w:hAnsi="Calibri" w:cs="Calibri"/>
-          <w:sz w:val="22"/>
-          <w:szCs w:val="22"/>
-          <w:lang w:eastAsia="en-US"/>
-        </w:rPr>
-        <w:t xml:space="preserve"> principles by Norman</w:t>
+        <w:t>, affordance, feedback, and mental models principles by Norman</w:t>
       </w:r>
       <w:sdt>
         <w:sdtPr>
@@ -8969,7 +9660,27 @@
           <w:szCs w:val="22"/>
           <w:lang w:eastAsia="en-US"/>
         </w:rPr>
-        <w:t xml:space="preserve"> by Lidwell et al.</w:t>
+        <w:t xml:space="preserve"> by </w:t>
+      </w:r>
+      <w:proofErr w:type="spellStart"/>
+      <w:r>
+        <w:rPr>
+          <w:rFonts w:ascii="Calibri" w:hAnsi="Calibri" w:cs="Calibri"/>
+          <w:sz w:val="22"/>
+          <w:szCs w:val="22"/>
+          <w:lang w:eastAsia="en-US"/>
+        </w:rPr>
+        <w:t>Lidwell</w:t>
+      </w:r>
+      <w:proofErr w:type="spellEnd"/>
+      <w:r>
+        <w:rPr>
+          <w:rFonts w:ascii="Calibri" w:hAnsi="Calibri" w:cs="Calibri"/>
+          <w:sz w:val="22"/>
+          <w:szCs w:val="22"/>
+          <w:lang w:eastAsia="en-US"/>
+        </w:rPr>
+        <w:t xml:space="preserve"> et al.</w:t>
       </w:r>
       <w:sdt>
         <w:sdtPr>
@@ -10005,29 +10716,7 @@
                 <w:sz w:val="22"/>
                 <w:szCs w:val="22"/>
               </w:rPr>
-              <w:t xml:space="preserve">Four </w:t>
-            </w:r>
-            <w:proofErr w:type="gramStart"/>
-            <w:r>
-              <w:rPr>
-                <w:rFonts w:ascii="Calibri" w:eastAsia="Calibri" w:hAnsi="Calibri" w:cs="Calibri"/>
-                <w:b w:val="0"/>
-                <w:bCs w:val="0"/>
-                <w:sz w:val="22"/>
-                <w:szCs w:val="22"/>
-              </w:rPr>
-              <w:t>large labelled</w:t>
-            </w:r>
-            <w:proofErr w:type="gramEnd"/>
-            <w:r>
-              <w:rPr>
-                <w:rFonts w:ascii="Calibri" w:eastAsia="Calibri" w:hAnsi="Calibri" w:cs="Calibri"/>
-                <w:b w:val="0"/>
-                <w:bCs w:val="0"/>
-                <w:sz w:val="22"/>
-                <w:szCs w:val="22"/>
-              </w:rPr>
-              <w:t xml:space="preserve"> actions on home (R1, R4, R9, R11)</w:t>
+              <w:t>Four large labelled actions on home (R1, R4, R9, R11)</w:t>
             </w:r>
           </w:p>
         </w:tc>
@@ -10051,25 +10740,7 @@
                 <w:sz w:val="22"/>
                 <w:szCs w:val="22"/>
               </w:rPr>
-              <w:t xml:space="preserve">No clear starting point; chatbot </w:t>
-            </w:r>
-            <w:proofErr w:type="gramStart"/>
-            <w:r>
-              <w:rPr>
-                <w:rFonts w:ascii="Calibri" w:eastAsia="Calibri" w:hAnsi="Calibri" w:cs="Calibri"/>
-                <w:sz w:val="22"/>
-                <w:szCs w:val="22"/>
-              </w:rPr>
-              <w:t>hard</w:t>
-            </w:r>
-            <w:proofErr w:type="gramEnd"/>
-            <w:r>
-              <w:rPr>
-                <w:rFonts w:ascii="Calibri" w:eastAsia="Calibri" w:hAnsi="Calibri" w:cs="Calibri"/>
-                <w:sz w:val="22"/>
-                <w:szCs w:val="22"/>
-              </w:rPr>
-              <w:t xml:space="preserve"> to find.</w:t>
+              <w:t>No clear starting point; chatbot hard to find.</w:t>
             </w:r>
           </w:p>
         </w:tc>
@@ -11705,27 +12376,7 @@
           <w:szCs w:val="22"/>
           <w:lang w:eastAsia="en-US"/>
         </w:rPr>
-        <w:t xml:space="preserve">The following section provides the final </w:t>
-      </w:r>
-      <w:proofErr w:type="gramStart"/>
-      <w:r>
-        <w:rPr>
-          <w:rFonts w:ascii="Calibri" w:hAnsi="Calibri" w:cs="Calibri"/>
-          <w:sz w:val="22"/>
-          <w:szCs w:val="22"/>
-          <w:lang w:eastAsia="en-US"/>
-        </w:rPr>
-        <w:t>high fidelity</w:t>
-      </w:r>
-      <w:proofErr w:type="gramEnd"/>
-      <w:r>
-        <w:rPr>
-          <w:rFonts w:ascii="Calibri" w:hAnsi="Calibri" w:cs="Calibri"/>
-          <w:sz w:val="22"/>
-          <w:szCs w:val="22"/>
-          <w:lang w:eastAsia="en-US"/>
-        </w:rPr>
-        <w:t xml:space="preserve"> screens (v3). The navigation system still consists of five bottom tabs that have labels. Each task screen has a back button on the left side and a help button on the right side; all other functions are hidden under "More".</w:t>
+        <w:t>The following section provides the final high fidelity screens (v3). The navigation system still consists of five bottom tabs that have labels. Each task screen has a back button on the left side and a help button on the right side; all other functions are hidden under "More".</w:t>
       </w:r>
     </w:p>
     <w:p>
@@ -11740,25 +12391,7 @@
         <w:rPr>
           <w:rFonts w:cs="Calibri"/>
         </w:rPr>
-        <w:t>4</w:t>
-      </w:r>
-      <w:r>
-        <w:rPr>
-          <w:rFonts w:cs="Calibri"/>
-        </w:rPr>
-        <w:t>.</w:t>
-      </w:r>
-      <w:r>
-        <w:rPr>
-          <w:rFonts w:cs="Calibri"/>
-        </w:rPr>
-        <w:t>1</w:t>
-      </w:r>
-      <w:r>
-        <w:rPr>
-          <w:rFonts w:cs="Calibri"/>
-        </w:rPr>
-        <w:t xml:space="preserve"> </w:t>
+        <w:t xml:space="preserve">4.1 </w:t>
       </w:r>
       <w:r>
         <w:rPr>
@@ -11770,6 +12403,196 @@
     </w:p>
     <w:p>
       <w:pPr>
+        <w:rPr>
+          <w:lang w:eastAsia="en-US"/>
+        </w:rPr>
+      </w:pPr>
+      <w:r>
+        <w:rPr>
+          <w:noProof/>
+        </w:rPr>
+        <w:drawing>
+          <wp:anchor distT="0" distB="0" distL="114300" distR="114300" simplePos="0" relativeHeight="251666432" behindDoc="0" locked="0" layoutInCell="1" allowOverlap="1" wp14:anchorId="573263DD" wp14:editId="58E8186B">
+            <wp:simplePos x="0" y="0"/>
+            <wp:positionH relativeFrom="column">
+              <wp:posOffset>0</wp:posOffset>
+            </wp:positionH>
+            <wp:positionV relativeFrom="paragraph">
+              <wp:posOffset>177800</wp:posOffset>
+            </wp:positionV>
+            <wp:extent cx="1764030" cy="3822065"/>
+            <wp:effectExtent l="0" t="0" r="7620" b="6985"/>
+            <wp:wrapTopAndBottom/>
+            <wp:docPr id="11" name="Picture 11"/>
+            <wp:cNvGraphicFramePr>
+              <a:graphicFrameLocks xmlns:a="http://schemas.openxmlformats.org/drawingml/2006/main" noChangeAspect="1"/>
+            </wp:cNvGraphicFramePr>
+            <a:graphic xmlns:a="http://schemas.openxmlformats.org/drawingml/2006/main">
+              <a:graphicData uri="http://schemas.openxmlformats.org/drawingml/2006/picture">
+                <pic:pic xmlns:pic="http://schemas.openxmlformats.org/drawingml/2006/picture">
+                  <pic:nvPicPr>
+                    <pic:cNvPr id="0" name="Picture 15"/>
+                    <pic:cNvPicPr>
+                      <a:picLocks noChangeAspect="1" noChangeArrowheads="1"/>
+                    </pic:cNvPicPr>
+                  </pic:nvPicPr>
+                  <pic:blipFill>
+                    <a:blip r:embed="rId24">
+                      <a:extLst>
+                        <a:ext uri="{28A0092B-C50C-407E-A947-70E740481C1C}">
+                          <a14:useLocalDpi xmlns:a14="http://schemas.microsoft.com/office/drawing/2010/main" val="0"/>
+                        </a:ext>
+                      </a:extLst>
+                    </a:blip>
+                    <a:srcRect/>
+                    <a:stretch>
+                      <a:fillRect/>
+                    </a:stretch>
+                  </pic:blipFill>
+                  <pic:spPr bwMode="auto">
+                    <a:xfrm>
+                      <a:off x="0" y="0"/>
+                      <a:ext cx="1764030" cy="3822065"/>
+                    </a:xfrm>
+                    <a:prstGeom prst="rect">
+                      <a:avLst/>
+                    </a:prstGeom>
+                    <a:noFill/>
+                    <a:ln>
+                      <a:noFill/>
+                    </a:ln>
+                  </pic:spPr>
+                </pic:pic>
+              </a:graphicData>
+            </a:graphic>
+          </wp:anchor>
+        </w:drawing>
+      </w:r>
+      <w:r>
+        <w:rPr>
+          <w:noProof/>
+        </w:rPr>
+        <w:drawing>
+          <wp:anchor distT="0" distB="0" distL="114300" distR="114300" simplePos="0" relativeHeight="251667456" behindDoc="0" locked="0" layoutInCell="1" allowOverlap="1" wp14:anchorId="432DEAA1" wp14:editId="5AFD9BC2">
+            <wp:simplePos x="0" y="0"/>
+            <wp:positionH relativeFrom="margin">
+              <wp:posOffset>1993265</wp:posOffset>
+            </wp:positionH>
+            <wp:positionV relativeFrom="paragraph">
+              <wp:posOffset>188595</wp:posOffset>
+            </wp:positionV>
+            <wp:extent cx="1764030" cy="3822065"/>
+            <wp:effectExtent l="0" t="0" r="7620" b="6985"/>
+            <wp:wrapTopAndBottom/>
+            <wp:docPr id="10" name="Picture 10"/>
+            <wp:cNvGraphicFramePr>
+              <a:graphicFrameLocks xmlns:a="http://schemas.openxmlformats.org/drawingml/2006/main" noChangeAspect="1"/>
+            </wp:cNvGraphicFramePr>
+            <a:graphic xmlns:a="http://schemas.openxmlformats.org/drawingml/2006/main">
+              <a:graphicData uri="http://schemas.openxmlformats.org/drawingml/2006/picture">
+                <pic:pic xmlns:pic="http://schemas.openxmlformats.org/drawingml/2006/picture">
+                  <pic:nvPicPr>
+                    <pic:cNvPr id="0" name="Picture 14"/>
+                    <pic:cNvPicPr>
+                      <a:picLocks noChangeAspect="1" noChangeArrowheads="1"/>
+                    </pic:cNvPicPr>
+                  </pic:nvPicPr>
+                  <pic:blipFill>
+                    <a:blip r:embed="rId25">
+                      <a:extLst>
+                        <a:ext uri="{28A0092B-C50C-407E-A947-70E740481C1C}">
+                          <a14:useLocalDpi xmlns:a14="http://schemas.microsoft.com/office/drawing/2010/main" val="0"/>
+                        </a:ext>
+                      </a:extLst>
+                    </a:blip>
+                    <a:srcRect/>
+                    <a:stretch>
+                      <a:fillRect/>
+                    </a:stretch>
+                  </pic:blipFill>
+                  <pic:spPr bwMode="auto">
+                    <a:xfrm>
+                      <a:off x="0" y="0"/>
+                      <a:ext cx="1764030" cy="3822065"/>
+                    </a:xfrm>
+                    <a:prstGeom prst="rect">
+                      <a:avLst/>
+                    </a:prstGeom>
+                    <a:noFill/>
+                    <a:ln>
+                      <a:noFill/>
+                    </a:ln>
+                  </pic:spPr>
+                </pic:pic>
+              </a:graphicData>
+            </a:graphic>
+          </wp:anchor>
+        </w:drawing>
+      </w:r>
+      <w:r>
+        <w:rPr>
+          <w:noProof/>
+        </w:rPr>
+        <w:drawing>
+          <wp:anchor distT="0" distB="0" distL="114300" distR="114300" simplePos="0" relativeHeight="251668480" behindDoc="0" locked="0" layoutInCell="1" allowOverlap="1" wp14:anchorId="538EF80E" wp14:editId="4E4D47FA">
+            <wp:simplePos x="0" y="0"/>
+            <wp:positionH relativeFrom="column">
+              <wp:posOffset>3983990</wp:posOffset>
+            </wp:positionH>
+            <wp:positionV relativeFrom="paragraph">
+              <wp:posOffset>177554</wp:posOffset>
+            </wp:positionV>
+            <wp:extent cx="1764030" cy="3822065"/>
+            <wp:effectExtent l="0" t="0" r="7620" b="6985"/>
+            <wp:wrapTopAndBottom/>
+            <wp:docPr id="9" name="Picture 9"/>
+            <wp:cNvGraphicFramePr>
+              <a:graphicFrameLocks xmlns:a="http://schemas.openxmlformats.org/drawingml/2006/main" noChangeAspect="1"/>
+            </wp:cNvGraphicFramePr>
+            <a:graphic xmlns:a="http://schemas.openxmlformats.org/drawingml/2006/main">
+              <a:graphicData uri="http://schemas.openxmlformats.org/drawingml/2006/picture">
+                <pic:pic xmlns:pic="http://schemas.openxmlformats.org/drawingml/2006/picture">
+                  <pic:nvPicPr>
+                    <pic:cNvPr id="0" name="Picture 13"/>
+                    <pic:cNvPicPr>
+                      <a:picLocks noChangeAspect="1" noChangeArrowheads="1"/>
+                    </pic:cNvPicPr>
+                  </pic:nvPicPr>
+                  <pic:blipFill>
+                    <a:blip r:embed="rId26">
+                      <a:extLst>
+                        <a:ext uri="{28A0092B-C50C-407E-A947-70E740481C1C}">
+                          <a14:useLocalDpi xmlns:a14="http://schemas.microsoft.com/office/drawing/2010/main" val="0"/>
+                        </a:ext>
+                      </a:extLst>
+                    </a:blip>
+                    <a:srcRect/>
+                    <a:stretch>
+                      <a:fillRect/>
+                    </a:stretch>
+                  </pic:blipFill>
+                  <pic:spPr bwMode="auto">
+                    <a:xfrm>
+                      <a:off x="0" y="0"/>
+                      <a:ext cx="1764030" cy="3822065"/>
+                    </a:xfrm>
+                    <a:prstGeom prst="rect">
+                      <a:avLst/>
+                    </a:prstGeom>
+                    <a:noFill/>
+                    <a:ln>
+                      <a:noFill/>
+                    </a:ln>
+                  </pic:spPr>
+                </pic:pic>
+              </a:graphicData>
+            </a:graphic>
+          </wp:anchor>
+        </w:drawing>
+      </w:r>
+    </w:p>
+    <w:p>
+      <w:pPr>
         <w:pStyle w:val="Caption"/>
         <w:jc w:val="center"/>
         <w:rPr>
@@ -11825,13 +12648,7 @@
         <w:rPr>
           <w:rFonts w:ascii="Calibri" w:hAnsi="Calibri" w:cs="Calibri"/>
         </w:rPr>
-        <w:t xml:space="preserve"> </w:t>
-      </w:r>
-      <w:r>
-        <w:rPr>
-          <w:rFonts w:ascii="Calibri" w:hAnsi="Calibri" w:cs="Calibri"/>
-        </w:rPr>
-        <w:t>Redesigned home screen, bank transfer screen and Binance AI help screen</w:t>
+        <w:t xml:space="preserve"> Redesigned home screen, bank transfer screen and Binance AI help screen</w:t>
       </w:r>
       <w:bookmarkEnd w:id="16"/>
     </w:p>
@@ -11883,29 +12700,202 @@
       <w:bookmarkStart w:id="17" w:name="_Toc242960535"/>
       <w:r>
         <w:rPr>
-          <w:rFonts w:cs="Calibri"/>
-        </w:rPr>
-        <w:t>4.</w:t>
+          <w:noProof/>
+        </w:rPr>
+        <w:lastRenderedPageBreak/>
+        <w:drawing>
+          <wp:anchor distT="0" distB="0" distL="114300" distR="114300" simplePos="0" relativeHeight="251669504" behindDoc="0" locked="0" layoutInCell="1" allowOverlap="1" wp14:anchorId="0EAD642E" wp14:editId="0C30201A">
+            <wp:simplePos x="0" y="0"/>
+            <wp:positionH relativeFrom="column">
+              <wp:posOffset>3804285</wp:posOffset>
+            </wp:positionH>
+            <wp:positionV relativeFrom="paragraph">
+              <wp:posOffset>386715</wp:posOffset>
+            </wp:positionV>
+            <wp:extent cx="1764030" cy="3822065"/>
+            <wp:effectExtent l="0" t="0" r="7620" b="6985"/>
+            <wp:wrapTopAndBottom/>
+            <wp:docPr id="12" name="Picture 12"/>
+            <wp:cNvGraphicFramePr>
+              <a:graphicFrameLocks xmlns:a="http://schemas.openxmlformats.org/drawingml/2006/main" noChangeAspect="1"/>
+            </wp:cNvGraphicFramePr>
+            <a:graphic xmlns:a="http://schemas.openxmlformats.org/drawingml/2006/main">
+              <a:graphicData uri="http://schemas.openxmlformats.org/drawingml/2006/picture">
+                <pic:pic xmlns:pic="http://schemas.openxmlformats.org/drawingml/2006/picture">
+                  <pic:nvPicPr>
+                    <pic:cNvPr id="0" name="Picture 19"/>
+                    <pic:cNvPicPr>
+                      <a:picLocks noChangeAspect="1" noChangeArrowheads="1"/>
+                    </pic:cNvPicPr>
+                  </pic:nvPicPr>
+                  <pic:blipFill>
+                    <a:blip r:embed="rId27">
+                      <a:extLst>
+                        <a:ext uri="{28A0092B-C50C-407E-A947-70E740481C1C}">
+                          <a14:useLocalDpi xmlns:a14="http://schemas.microsoft.com/office/drawing/2010/main" val="0"/>
+                        </a:ext>
+                      </a:extLst>
+                    </a:blip>
+                    <a:srcRect/>
+                    <a:stretch>
+                      <a:fillRect/>
+                    </a:stretch>
+                  </pic:blipFill>
+                  <pic:spPr bwMode="auto">
+                    <a:xfrm>
+                      <a:off x="0" y="0"/>
+                      <a:ext cx="1764030" cy="3822065"/>
+                    </a:xfrm>
+                    <a:prstGeom prst="rect">
+                      <a:avLst/>
+                    </a:prstGeom>
+                    <a:noFill/>
+                    <a:ln>
+                      <a:noFill/>
+                    </a:ln>
+                  </pic:spPr>
+                </pic:pic>
+              </a:graphicData>
+            </a:graphic>
+          </wp:anchor>
+        </w:drawing>
       </w:r>
       <w:r>
         <w:rPr>
-          <w:rFonts w:cs="Calibri"/>
-        </w:rPr>
-        <w:t>2</w:t>
+          <w:noProof/>
+        </w:rPr>
+        <w:drawing>
+          <wp:anchor distT="0" distB="0" distL="114300" distR="114300" simplePos="0" relativeHeight="251671552" behindDoc="0" locked="0" layoutInCell="1" allowOverlap="1" wp14:anchorId="474A9D2D" wp14:editId="410A558D">
+            <wp:simplePos x="0" y="0"/>
+            <wp:positionH relativeFrom="margin">
+              <wp:posOffset>1904365</wp:posOffset>
+            </wp:positionH>
+            <wp:positionV relativeFrom="paragraph">
+              <wp:posOffset>382905</wp:posOffset>
+            </wp:positionV>
+            <wp:extent cx="1764320" cy="3822192"/>
+            <wp:effectExtent l="0" t="0" r="7620" b="6985"/>
+            <wp:wrapTopAndBottom/>
+            <wp:docPr id="14" name="Picture 14"/>
+            <wp:cNvGraphicFramePr>
+              <a:graphicFrameLocks xmlns:a="http://schemas.openxmlformats.org/drawingml/2006/main" noChangeAspect="1"/>
+            </wp:cNvGraphicFramePr>
+            <a:graphic xmlns:a="http://schemas.openxmlformats.org/drawingml/2006/main">
+              <a:graphicData uri="http://schemas.openxmlformats.org/drawingml/2006/picture">
+                <pic:pic xmlns:pic="http://schemas.openxmlformats.org/drawingml/2006/picture">
+                  <pic:nvPicPr>
+                    <pic:cNvPr id="0" name="Picture 21"/>
+                    <pic:cNvPicPr>
+                      <a:picLocks noChangeAspect="1" noChangeArrowheads="1"/>
+                    </pic:cNvPicPr>
+                  </pic:nvPicPr>
+                  <pic:blipFill>
+                    <a:blip r:embed="rId28">
+                      <a:extLst>
+                        <a:ext uri="{28A0092B-C50C-407E-A947-70E740481C1C}">
+                          <a14:useLocalDpi xmlns:a14="http://schemas.microsoft.com/office/drawing/2010/main" val="0"/>
+                        </a:ext>
+                      </a:extLst>
+                    </a:blip>
+                    <a:srcRect/>
+                    <a:stretch>
+                      <a:fillRect/>
+                    </a:stretch>
+                  </pic:blipFill>
+                  <pic:spPr bwMode="auto">
+                    <a:xfrm>
+                      <a:off x="0" y="0"/>
+                      <a:ext cx="1764320" cy="3822192"/>
+                    </a:xfrm>
+                    <a:prstGeom prst="rect">
+                      <a:avLst/>
+                    </a:prstGeom>
+                    <a:noFill/>
+                    <a:ln>
+                      <a:noFill/>
+                    </a:ln>
+                  </pic:spPr>
+                </pic:pic>
+              </a:graphicData>
+            </a:graphic>
+          </wp:anchor>
+        </w:drawing>
       </w:r>
       <w:r>
         <w:rPr>
-          <w:rFonts w:cs="Calibri"/>
-        </w:rPr>
-        <w:t xml:space="preserve"> </w:t>
+          <w:noProof/>
+        </w:rPr>
+        <w:drawing>
+          <wp:anchor distT="0" distB="0" distL="114300" distR="114300" simplePos="0" relativeHeight="251670528" behindDoc="0" locked="0" layoutInCell="1" allowOverlap="1" wp14:anchorId="147CB160" wp14:editId="4480D6BE">
+            <wp:simplePos x="0" y="0"/>
+            <wp:positionH relativeFrom="margin">
+              <wp:posOffset>0</wp:posOffset>
+            </wp:positionH>
+            <wp:positionV relativeFrom="paragraph">
+              <wp:posOffset>388620</wp:posOffset>
+            </wp:positionV>
+            <wp:extent cx="1764030" cy="3822065"/>
+            <wp:effectExtent l="0" t="0" r="7620" b="6985"/>
+            <wp:wrapTopAndBottom/>
+            <wp:docPr id="13" name="Picture 13"/>
+            <wp:cNvGraphicFramePr>
+              <a:graphicFrameLocks xmlns:a="http://schemas.openxmlformats.org/drawingml/2006/main" noChangeAspect="1"/>
+            </wp:cNvGraphicFramePr>
+            <a:graphic xmlns:a="http://schemas.openxmlformats.org/drawingml/2006/main">
+              <a:graphicData uri="http://schemas.openxmlformats.org/drawingml/2006/picture">
+                <pic:pic xmlns:pic="http://schemas.openxmlformats.org/drawingml/2006/picture">
+                  <pic:nvPicPr>
+                    <pic:cNvPr id="0" name="Picture 20"/>
+                    <pic:cNvPicPr>
+                      <a:picLocks noChangeAspect="1" noChangeArrowheads="1"/>
+                    </pic:cNvPicPr>
+                  </pic:nvPicPr>
+                  <pic:blipFill>
+                    <a:blip r:embed="rId29">
+                      <a:extLst>
+                        <a:ext uri="{28A0092B-C50C-407E-A947-70E740481C1C}">
+                          <a14:useLocalDpi xmlns:a14="http://schemas.microsoft.com/office/drawing/2010/main" val="0"/>
+                        </a:ext>
+                      </a:extLst>
+                    </a:blip>
+                    <a:srcRect/>
+                    <a:stretch>
+                      <a:fillRect/>
+                    </a:stretch>
+                  </pic:blipFill>
+                  <pic:spPr bwMode="auto">
+                    <a:xfrm>
+                      <a:off x="0" y="0"/>
+                      <a:ext cx="1764030" cy="3822065"/>
+                    </a:xfrm>
+                    <a:prstGeom prst="rect">
+                      <a:avLst/>
+                    </a:prstGeom>
+                    <a:noFill/>
+                    <a:ln>
+                      <a:noFill/>
+                    </a:ln>
+                  </pic:spPr>
+                </pic:pic>
+              </a:graphicData>
+            </a:graphic>
+          </wp:anchor>
+        </w:drawing>
       </w:r>
       <w:r>
         <w:rPr>
           <w:rFonts w:cs="Calibri"/>
         </w:rPr>
-        <w:t>Buy flow</w:t>
+        <w:t>4.2 Buy flow</w:t>
       </w:r>
       <w:bookmarkEnd w:id="17"/>
+    </w:p>
+    <w:p>
+      <w:pPr>
+        <w:rPr>
+          <w:lang w:eastAsia="en-US"/>
+        </w:rPr>
+      </w:pPr>
     </w:p>
     <w:p>
       <w:pPr>
@@ -12005,19 +12995,19 @@
           <w:szCs w:val="22"/>
           <w:lang w:eastAsia="en-US"/>
         </w:rPr>
-        <w:t xml:space="preserve">In Step 1, there is a big input along with live conversion, quick amount chips, and price and limit summary. In Step 2, there is a recommendation of one seller along with the number of trades, completion rate, and best price tag. It maintains optional comparison and shows payment in the form of a single selectable card. In Step 3, all figures are shown </w:t>
+        <w:t>In Step 1, there is a big input along with live conversion, quick amount chips, and price and limit summary. In Step 2, there is a recommendation of one seller along with the number of trades, completion rate, and best price tag. It maintains optional comparison and shows payment in the form of a single selectable card. In Step 3, all figures are shown at one place and it tells what will happen next with an edit option.</w:t>
       </w:r>
-      <w:proofErr w:type="gramStart"/>
-      <w:r>
+    </w:p>
+    <w:p>
+      <w:pPr>
+        <w:spacing w:line="278" w:lineRule="auto"/>
         <w:rPr>
           <w:rFonts w:ascii="Calibri" w:hAnsi="Calibri" w:cs="Calibri"/>
           <w:sz w:val="22"/>
           <w:szCs w:val="22"/>
           <w:lang w:eastAsia="en-US"/>
         </w:rPr>
-        <w:t>at</w:t>
-      </w:r>
-      <w:proofErr w:type="gramEnd"/>
+      </w:pPr>
       <w:r>
         <w:rPr>
           <w:rFonts w:ascii="Calibri" w:hAnsi="Calibri" w:cs="Calibri"/>
@@ -12025,27 +13015,7 @@
           <w:szCs w:val="22"/>
           <w:lang w:eastAsia="en-US"/>
         </w:rPr>
-        <w:t xml:space="preserve"> one </w:t>
-      </w:r>
-      <w:proofErr w:type="gramStart"/>
-      <w:r>
-        <w:rPr>
-          <w:rFonts w:ascii="Calibri" w:hAnsi="Calibri" w:cs="Calibri"/>
-          <w:sz w:val="22"/>
-          <w:szCs w:val="22"/>
-          <w:lang w:eastAsia="en-US"/>
-        </w:rPr>
-        <w:t>place</w:t>
-      </w:r>
-      <w:proofErr w:type="gramEnd"/>
-      <w:r>
-        <w:rPr>
-          <w:rFonts w:ascii="Calibri" w:hAnsi="Calibri" w:cs="Calibri"/>
-          <w:sz w:val="22"/>
-          <w:szCs w:val="22"/>
-          <w:lang w:eastAsia="en-US"/>
-        </w:rPr>
-        <w:t xml:space="preserve"> and it tells what will happen next with an edit option.</w:t>
+        <w:br w:type="page"/>
       </w:r>
     </w:p>
     <w:p>
@@ -12060,6 +13030,7 @@
         <w:rPr>
           <w:rFonts w:cs="Calibri"/>
         </w:rPr>
+        <w:lastRenderedPageBreak/>
         <w:t>4.</w:t>
       </w:r>
       <w:r>
@@ -12072,21 +13043,217 @@
         <w:rPr>
           <w:rFonts w:cs="Calibri"/>
         </w:rPr>
-        <w:t xml:space="preserve"> </w:t>
+        <w:t xml:space="preserve"> Sell flow</w:t>
+      </w:r>
+      <w:bookmarkEnd w:id="19"/>
+    </w:p>
+    <w:p>
+      <w:pPr>
+        <w:rPr>
+          <w:lang w:eastAsia="en-US"/>
+        </w:rPr>
+      </w:pPr>
+      <w:r>
+        <w:rPr>
+          <w:noProof/>
+        </w:rPr>
+        <w:drawing>
+          <wp:anchor distT="0" distB="0" distL="114300" distR="114300" simplePos="0" relativeHeight="251673600" behindDoc="0" locked="0" layoutInCell="1" allowOverlap="1" wp14:anchorId="00ADD03E" wp14:editId="271A9D23">
+            <wp:simplePos x="0" y="0"/>
+            <wp:positionH relativeFrom="margin">
+              <wp:posOffset>0</wp:posOffset>
+            </wp:positionH>
+            <wp:positionV relativeFrom="paragraph">
+              <wp:posOffset>313690</wp:posOffset>
+            </wp:positionV>
+            <wp:extent cx="1764030" cy="3822065"/>
+            <wp:effectExtent l="0" t="0" r="7620" b="6985"/>
+            <wp:wrapTopAndBottom/>
+            <wp:docPr id="16" name="Picture 16"/>
+            <wp:cNvGraphicFramePr>
+              <a:graphicFrameLocks xmlns:a="http://schemas.openxmlformats.org/drawingml/2006/main" noChangeAspect="1"/>
+            </wp:cNvGraphicFramePr>
+            <a:graphic xmlns:a="http://schemas.openxmlformats.org/drawingml/2006/main">
+              <a:graphicData uri="http://schemas.openxmlformats.org/drawingml/2006/picture">
+                <pic:pic xmlns:pic="http://schemas.openxmlformats.org/drawingml/2006/picture">
+                  <pic:nvPicPr>
+                    <pic:cNvPr id="0" name="Picture 26"/>
+                    <pic:cNvPicPr>
+                      <a:picLocks noChangeAspect="1" noChangeArrowheads="1"/>
+                    </pic:cNvPicPr>
+                  </pic:nvPicPr>
+                  <pic:blipFill>
+                    <a:blip r:embed="rId30">
+                      <a:extLst>
+                        <a:ext uri="{28A0092B-C50C-407E-A947-70E740481C1C}">
+                          <a14:useLocalDpi xmlns:a14="http://schemas.microsoft.com/office/drawing/2010/main" val="0"/>
+                        </a:ext>
+                      </a:extLst>
+                    </a:blip>
+                    <a:srcRect/>
+                    <a:stretch>
+                      <a:fillRect/>
+                    </a:stretch>
+                  </pic:blipFill>
+                  <pic:spPr bwMode="auto">
+                    <a:xfrm>
+                      <a:off x="0" y="0"/>
+                      <a:ext cx="1764030" cy="3822065"/>
+                    </a:xfrm>
+                    <a:prstGeom prst="rect">
+                      <a:avLst/>
+                    </a:prstGeom>
+                    <a:noFill/>
+                    <a:ln>
+                      <a:noFill/>
+                    </a:ln>
+                  </pic:spPr>
+                </pic:pic>
+              </a:graphicData>
+            </a:graphic>
+            <wp14:sizeRelH relativeFrom="margin">
+              <wp14:pctWidth>0</wp14:pctWidth>
+            </wp14:sizeRelH>
+            <wp14:sizeRelV relativeFrom="margin">
+              <wp14:pctHeight>0</wp14:pctHeight>
+            </wp14:sizeRelV>
+          </wp:anchor>
+        </w:drawing>
       </w:r>
       <w:r>
         <w:rPr>
-          <w:rFonts w:cs="Calibri"/>
-        </w:rPr>
-        <w:t>Sell</w:t>
+          <w:noProof/>
+        </w:rPr>
+        <w:drawing>
+          <wp:anchor distT="0" distB="0" distL="114300" distR="114300" simplePos="0" relativeHeight="251674624" behindDoc="0" locked="0" layoutInCell="1" allowOverlap="1" wp14:anchorId="430B0D8D" wp14:editId="1A13A44B">
+            <wp:simplePos x="0" y="0"/>
+            <wp:positionH relativeFrom="margin">
+              <wp:posOffset>1927225</wp:posOffset>
+            </wp:positionH>
+            <wp:positionV relativeFrom="paragraph">
+              <wp:posOffset>319405</wp:posOffset>
+            </wp:positionV>
+            <wp:extent cx="1764030" cy="3822065"/>
+            <wp:effectExtent l="0" t="0" r="7620" b="6985"/>
+            <wp:wrapTopAndBottom/>
+            <wp:docPr id="17" name="Picture 17"/>
+            <wp:cNvGraphicFramePr>
+              <a:graphicFrameLocks xmlns:a="http://schemas.openxmlformats.org/drawingml/2006/main" noChangeAspect="1"/>
+            </wp:cNvGraphicFramePr>
+            <a:graphic xmlns:a="http://schemas.openxmlformats.org/drawingml/2006/main">
+              <a:graphicData uri="http://schemas.openxmlformats.org/drawingml/2006/picture">
+                <pic:pic xmlns:pic="http://schemas.openxmlformats.org/drawingml/2006/picture">
+                  <pic:nvPicPr>
+                    <pic:cNvPr id="0" name="Picture 27"/>
+                    <pic:cNvPicPr>
+                      <a:picLocks noChangeAspect="1" noChangeArrowheads="1"/>
+                    </pic:cNvPicPr>
+                  </pic:nvPicPr>
+                  <pic:blipFill>
+                    <a:blip r:embed="rId31">
+                      <a:extLst>
+                        <a:ext uri="{28A0092B-C50C-407E-A947-70E740481C1C}">
+                          <a14:useLocalDpi xmlns:a14="http://schemas.microsoft.com/office/drawing/2010/main" val="0"/>
+                        </a:ext>
+                      </a:extLst>
+                    </a:blip>
+                    <a:srcRect/>
+                    <a:stretch>
+                      <a:fillRect/>
+                    </a:stretch>
+                  </pic:blipFill>
+                  <pic:spPr bwMode="auto">
+                    <a:xfrm>
+                      <a:off x="0" y="0"/>
+                      <a:ext cx="1764030" cy="3822065"/>
+                    </a:xfrm>
+                    <a:prstGeom prst="rect">
+                      <a:avLst/>
+                    </a:prstGeom>
+                    <a:noFill/>
+                    <a:ln>
+                      <a:noFill/>
+                    </a:ln>
+                  </pic:spPr>
+                </pic:pic>
+              </a:graphicData>
+            </a:graphic>
+            <wp14:sizeRelH relativeFrom="margin">
+              <wp14:pctWidth>0</wp14:pctWidth>
+            </wp14:sizeRelH>
+            <wp14:sizeRelV relativeFrom="margin">
+              <wp14:pctHeight>0</wp14:pctHeight>
+            </wp14:sizeRelV>
+          </wp:anchor>
+        </w:drawing>
       </w:r>
       <w:r>
         <w:rPr>
-          <w:rFonts w:cs="Calibri"/>
-        </w:rPr>
-        <w:t xml:space="preserve"> flow</w:t>
+          <w:noProof/>
+        </w:rPr>
+        <w:drawing>
+          <wp:anchor distT="0" distB="0" distL="114300" distR="114300" simplePos="0" relativeHeight="251675648" behindDoc="0" locked="0" layoutInCell="1" allowOverlap="1" wp14:anchorId="7E9286BE" wp14:editId="56481B63">
+            <wp:simplePos x="0" y="0"/>
+            <wp:positionH relativeFrom="margin">
+              <wp:posOffset>3845560</wp:posOffset>
+            </wp:positionH>
+            <wp:positionV relativeFrom="paragraph">
+              <wp:posOffset>319405</wp:posOffset>
+            </wp:positionV>
+            <wp:extent cx="1764030" cy="3822065"/>
+            <wp:effectExtent l="0" t="0" r="7620" b="6985"/>
+            <wp:wrapTopAndBottom/>
+            <wp:docPr id="15" name="Picture 15"/>
+            <wp:cNvGraphicFramePr>
+              <a:graphicFrameLocks xmlns:a="http://schemas.openxmlformats.org/drawingml/2006/main" noChangeAspect="1"/>
+            </wp:cNvGraphicFramePr>
+            <a:graphic xmlns:a="http://schemas.openxmlformats.org/drawingml/2006/main">
+              <a:graphicData uri="http://schemas.openxmlformats.org/drawingml/2006/picture">
+                <pic:pic xmlns:pic="http://schemas.openxmlformats.org/drawingml/2006/picture">
+                  <pic:nvPicPr>
+                    <pic:cNvPr id="0" name="Picture 25"/>
+                    <pic:cNvPicPr>
+                      <a:picLocks noChangeAspect="1" noChangeArrowheads="1"/>
+                    </pic:cNvPicPr>
+                  </pic:nvPicPr>
+                  <pic:blipFill>
+                    <a:blip r:embed="rId32">
+                      <a:extLst>
+                        <a:ext uri="{28A0092B-C50C-407E-A947-70E740481C1C}">
+                          <a14:useLocalDpi xmlns:a14="http://schemas.microsoft.com/office/drawing/2010/main" val="0"/>
+                        </a:ext>
+                      </a:extLst>
+                    </a:blip>
+                    <a:srcRect/>
+                    <a:stretch>
+                      <a:fillRect/>
+                    </a:stretch>
+                  </pic:blipFill>
+                  <pic:spPr bwMode="auto">
+                    <a:xfrm>
+                      <a:off x="0" y="0"/>
+                      <a:ext cx="1764030" cy="3822065"/>
+                    </a:xfrm>
+                    <a:prstGeom prst="rect">
+                      <a:avLst/>
+                    </a:prstGeom>
+                    <a:noFill/>
+                    <a:ln>
+                      <a:noFill/>
+                    </a:ln>
+                  </pic:spPr>
+                </pic:pic>
+              </a:graphicData>
+            </a:graphic>
+            <wp14:sizeRelH relativeFrom="margin">
+              <wp14:pctWidth>0</wp14:pctWidth>
+            </wp14:sizeRelH>
+            <wp14:sizeRelV relativeFrom="margin">
+              <wp14:pctHeight>0</wp14:pctHeight>
+            </wp14:sizeRelV>
+          </wp:anchor>
+        </w:drawing>
       </w:r>
-      <w:bookmarkEnd w:id="19"/>
     </w:p>
     <w:p>
       <w:pPr>
@@ -12411,16 +13578,7 @@
           <w:szCs w:val="22"/>
           <w:lang w:eastAsia="en-US"/>
         </w:rPr>
-        <w:t>a contrast audit applied the WCAG relative-luminance formula</w:t>
-      </w:r>
-      <w:r>
-        <w:rPr>
-          <w:rFonts w:ascii="Calibri" w:hAnsi="Calibri" w:cs="Calibri"/>
-          <w:sz w:val="22"/>
-          <w:szCs w:val="22"/>
-          <w:lang w:eastAsia="en-US"/>
-        </w:rPr>
-        <w:t xml:space="preserve"> </w:t>
+        <w:t xml:space="preserve">a contrast audit applied the WCAG relative-luminance formula </w:t>
       </w:r>
       <w:sdt>
         <w:sdtPr>
@@ -12514,19 +13672,7 @@
           <w:rFonts w:cs="Calibri"/>
         </w:rPr>
         <w:lastRenderedPageBreak/>
-        <w:t>5.</w:t>
-      </w:r>
-      <w:r>
-        <w:rPr>
-          <w:rFonts w:cs="Calibri"/>
-        </w:rPr>
-        <w:t>2</w:t>
-      </w:r>
-      <w:r>
-        <w:rPr>
-          <w:rFonts w:cs="Calibri"/>
-        </w:rPr>
-        <w:t xml:space="preserve"> </w:t>
+        <w:t xml:space="preserve">5.2 </w:t>
       </w:r>
       <w:r>
         <w:rPr>
@@ -12855,15 +14001,7 @@
                 <w:sz w:val="22"/>
                 <w:szCs w:val="22"/>
               </w:rPr>
-              <w:t>&gt;</w:t>
-            </w:r>
-            <w:r>
-              <w:rPr>
-                <w:rFonts w:ascii="Calibri" w:eastAsia="Calibri" w:hAnsi="Calibri" w:cs="Calibri"/>
-                <w:sz w:val="22"/>
-                <w:szCs w:val="22"/>
-              </w:rPr>
-              <w:t xml:space="preserve"> </w:t>
+              <w:t xml:space="preserve">&gt; </w:t>
             </w:r>
             <w:r>
               <w:rPr>
@@ -12879,15 +14017,7 @@
                 <w:sz w:val="22"/>
                 <w:szCs w:val="22"/>
               </w:rPr>
-              <w:t>&gt;</w:t>
-            </w:r>
-            <w:r>
-              <w:rPr>
-                <w:rFonts w:ascii="Calibri" w:eastAsia="Calibri" w:hAnsi="Calibri" w:cs="Calibri"/>
-                <w:sz w:val="22"/>
-                <w:szCs w:val="22"/>
-              </w:rPr>
-              <w:t xml:space="preserve"> </w:t>
+              <w:t xml:space="preserve">&gt; </w:t>
             </w:r>
             <w:r>
               <w:rPr>
@@ -12903,15 +14033,7 @@
                 <w:sz w:val="22"/>
                 <w:szCs w:val="22"/>
               </w:rPr>
-              <w:t>&gt;</w:t>
-            </w:r>
-            <w:r>
-              <w:rPr>
-                <w:rFonts w:ascii="Calibri" w:eastAsia="Calibri" w:hAnsi="Calibri" w:cs="Calibri"/>
-                <w:sz w:val="22"/>
-                <w:szCs w:val="22"/>
-              </w:rPr>
-              <w:t xml:space="preserve"> </w:t>
+              <w:t xml:space="preserve">&gt; </w:t>
             </w:r>
             <w:r>
               <w:rPr>
@@ -12927,15 +14049,7 @@
                 <w:sz w:val="22"/>
                 <w:szCs w:val="22"/>
               </w:rPr>
-              <w:t>&gt;</w:t>
-            </w:r>
-            <w:r>
-              <w:rPr>
-                <w:rFonts w:ascii="Calibri" w:eastAsia="Calibri" w:hAnsi="Calibri" w:cs="Calibri"/>
-                <w:sz w:val="22"/>
-                <w:szCs w:val="22"/>
-              </w:rPr>
-              <w:t xml:space="preserve"> </w:t>
+              <w:t xml:space="preserve">&gt; </w:t>
             </w:r>
             <w:r>
               <w:rPr>
@@ -12951,15 +14065,7 @@
                 <w:sz w:val="22"/>
                 <w:szCs w:val="22"/>
               </w:rPr>
-              <w:t>&gt;</w:t>
-            </w:r>
-            <w:r>
-              <w:rPr>
-                <w:rFonts w:ascii="Calibri" w:eastAsia="Calibri" w:hAnsi="Calibri" w:cs="Calibri"/>
-                <w:sz w:val="22"/>
-                <w:szCs w:val="22"/>
-              </w:rPr>
-              <w:t xml:space="preserve"> </w:t>
+              <w:t xml:space="preserve">&gt; </w:t>
             </w:r>
             <w:r>
               <w:rPr>
@@ -13094,15 +14200,7 @@
                 <w:sz w:val="22"/>
                 <w:szCs w:val="22"/>
               </w:rPr>
-              <w:t>&gt;</w:t>
-            </w:r>
-            <w:r>
-              <w:rPr>
-                <w:rFonts w:ascii="Calibri" w:eastAsia="Calibri" w:hAnsi="Calibri" w:cs="Calibri"/>
-                <w:sz w:val="22"/>
-                <w:szCs w:val="22"/>
-              </w:rPr>
-              <w:t xml:space="preserve"> </w:t>
+              <w:t xml:space="preserve">&gt; </w:t>
             </w:r>
             <w:r>
               <w:rPr>
@@ -13118,15 +14216,7 @@
                 <w:sz w:val="22"/>
                 <w:szCs w:val="22"/>
               </w:rPr>
-              <w:t>&gt;</w:t>
-            </w:r>
-            <w:r>
-              <w:rPr>
-                <w:rFonts w:ascii="Calibri" w:eastAsia="Calibri" w:hAnsi="Calibri" w:cs="Calibri"/>
-                <w:sz w:val="22"/>
-                <w:szCs w:val="22"/>
-              </w:rPr>
-              <w:t xml:space="preserve"> </w:t>
+              <w:t xml:space="preserve">&gt; </w:t>
             </w:r>
             <w:r>
               <w:rPr>
@@ -13142,15 +14232,7 @@
                 <w:sz w:val="22"/>
                 <w:szCs w:val="22"/>
               </w:rPr>
-              <w:t>&gt;</w:t>
-            </w:r>
-            <w:r>
-              <w:rPr>
-                <w:rFonts w:ascii="Calibri" w:eastAsia="Calibri" w:hAnsi="Calibri" w:cs="Calibri"/>
-                <w:sz w:val="22"/>
-                <w:szCs w:val="22"/>
-              </w:rPr>
-              <w:t xml:space="preserve"> </w:t>
+              <w:t xml:space="preserve">&gt; </w:t>
             </w:r>
             <w:r>
               <w:rPr>
@@ -13166,15 +14248,7 @@
                 <w:sz w:val="22"/>
                 <w:szCs w:val="22"/>
               </w:rPr>
-              <w:t>&gt;</w:t>
-            </w:r>
-            <w:r>
-              <w:rPr>
-                <w:rFonts w:ascii="Calibri" w:eastAsia="Calibri" w:hAnsi="Calibri" w:cs="Calibri"/>
-                <w:sz w:val="22"/>
-                <w:szCs w:val="22"/>
-              </w:rPr>
-              <w:t xml:space="preserve"> </w:t>
+              <w:t xml:space="preserve">&gt; </w:t>
             </w:r>
             <w:r>
               <w:rPr>
@@ -13190,15 +14264,7 @@
                 <w:sz w:val="22"/>
                 <w:szCs w:val="22"/>
               </w:rPr>
-              <w:t>&gt;</w:t>
-            </w:r>
-            <w:r>
-              <w:rPr>
-                <w:rFonts w:ascii="Calibri" w:eastAsia="Calibri" w:hAnsi="Calibri" w:cs="Calibri"/>
-                <w:sz w:val="22"/>
-                <w:szCs w:val="22"/>
-              </w:rPr>
-              <w:t xml:space="preserve"> </w:t>
+              <w:t xml:space="preserve">&gt; </w:t>
             </w:r>
             <w:r>
               <w:rPr>
@@ -13330,15 +14396,7 @@
                 <w:sz w:val="22"/>
                 <w:szCs w:val="22"/>
               </w:rPr>
-              <w:t>&gt;</w:t>
-            </w:r>
-            <w:r>
-              <w:rPr>
-                <w:rFonts w:ascii="Calibri" w:eastAsia="Calibri" w:hAnsi="Calibri" w:cs="Calibri"/>
-                <w:sz w:val="22"/>
-                <w:szCs w:val="22"/>
-              </w:rPr>
-              <w:t xml:space="preserve"> </w:t>
+              <w:t xml:space="preserve">&gt; </w:t>
             </w:r>
             <w:r>
               <w:rPr>
@@ -13354,15 +14412,7 @@
                 <w:sz w:val="22"/>
                 <w:szCs w:val="22"/>
               </w:rPr>
-              <w:t>&gt;</w:t>
-            </w:r>
-            <w:r>
-              <w:rPr>
-                <w:rFonts w:ascii="Calibri" w:eastAsia="Calibri" w:hAnsi="Calibri" w:cs="Calibri"/>
-                <w:sz w:val="22"/>
-                <w:szCs w:val="22"/>
-              </w:rPr>
-              <w:t xml:space="preserve"> </w:t>
+              <w:t xml:space="preserve">&gt; </w:t>
             </w:r>
             <w:r>
               <w:rPr>
@@ -13378,15 +14428,7 @@
                 <w:sz w:val="22"/>
                 <w:szCs w:val="22"/>
               </w:rPr>
-              <w:t>&gt;</w:t>
-            </w:r>
-            <w:r>
-              <w:rPr>
-                <w:rFonts w:ascii="Calibri" w:eastAsia="Calibri" w:hAnsi="Calibri" w:cs="Calibri"/>
-                <w:sz w:val="22"/>
-                <w:szCs w:val="22"/>
-              </w:rPr>
-              <w:t xml:space="preserve"> </w:t>
+              <w:t xml:space="preserve">&gt; </w:t>
             </w:r>
             <w:r>
               <w:rPr>
@@ -13505,15 +14547,7 @@
                 <w:sz w:val="22"/>
                 <w:szCs w:val="22"/>
               </w:rPr>
-              <w:t>&gt;</w:t>
-            </w:r>
-            <w:r>
-              <w:rPr>
-                <w:rFonts w:ascii="Calibri" w:eastAsia="Calibri" w:hAnsi="Calibri" w:cs="Calibri"/>
-                <w:sz w:val="22"/>
-                <w:szCs w:val="22"/>
-              </w:rPr>
-              <w:t xml:space="preserve"> </w:t>
+              <w:t xml:space="preserve">&gt; </w:t>
             </w:r>
             <w:r>
               <w:rPr>
@@ -13529,15 +14563,7 @@
                 <w:sz w:val="22"/>
                 <w:szCs w:val="22"/>
               </w:rPr>
-              <w:t>&gt;</w:t>
-            </w:r>
-            <w:r>
-              <w:rPr>
-                <w:rFonts w:ascii="Calibri" w:eastAsia="Calibri" w:hAnsi="Calibri" w:cs="Calibri"/>
-                <w:sz w:val="22"/>
-                <w:szCs w:val="22"/>
-              </w:rPr>
-              <w:t xml:space="preserve"> </w:t>
+              <w:t xml:space="preserve">&gt; </w:t>
             </w:r>
             <w:r>
               <w:rPr>
@@ -13649,13 +14675,7 @@
         <w:rPr>
           <w:rFonts w:ascii="Calibri" w:hAnsi="Calibri" w:cs="Calibri"/>
         </w:rPr>
-        <w:t xml:space="preserve">: </w:t>
-      </w:r>
-      <w:r>
-        <w:rPr>
-          <w:rFonts w:ascii="Calibri" w:hAnsi="Calibri" w:cs="Calibri"/>
-        </w:rPr>
-        <w:t>Cognitive walkthrough</w:t>
+        <w:t>: Cognitive walkthrough</w:t>
       </w:r>
     </w:p>
     <w:p>
@@ -14011,20 +15031,8 @@
                 <w:sz w:val="22"/>
                 <w:szCs w:val="22"/>
               </w:rPr>
-              <w:t xml:space="preserve">2 Real-world </w:t>
-            </w:r>
-            <w:proofErr w:type="gramStart"/>
-            <w:r>
-              <w:rPr>
-                <w:rFonts w:ascii="Calibri" w:eastAsia="Calibri" w:hAnsi="Calibri" w:cs="Calibri"/>
-                <w:b w:val="0"/>
-                <w:bCs w:val="0"/>
-                <w:sz w:val="22"/>
-                <w:szCs w:val="22"/>
-              </w:rPr>
-              <w:t>match</w:t>
-            </w:r>
-            <w:proofErr w:type="gramEnd"/>
+              <w:t>2 Real-world match</w:t>
+            </w:r>
           </w:p>
         </w:tc>
         <w:tc>
@@ -14759,25 +15767,7 @@
                 <w:sz w:val="22"/>
                 <w:szCs w:val="22"/>
               </w:rPr>
-              <w:t xml:space="preserve">Error states </w:t>
-            </w:r>
-            <w:proofErr w:type="gramStart"/>
-            <w:r>
-              <w:rPr>
-                <w:rFonts w:ascii="Calibri" w:eastAsia="Calibri" w:hAnsi="Calibri" w:cs="Calibri"/>
-                <w:sz w:val="22"/>
-                <w:szCs w:val="22"/>
-              </w:rPr>
-              <w:t>not</w:t>
-            </w:r>
-            <w:proofErr w:type="gramEnd"/>
-            <w:r>
-              <w:rPr>
-                <w:rFonts w:ascii="Calibri" w:eastAsia="Calibri" w:hAnsi="Calibri" w:cs="Calibri"/>
-                <w:sz w:val="22"/>
-                <w:szCs w:val="22"/>
-              </w:rPr>
-              <w:t xml:space="preserve"> designed.</w:t>
+              <w:t>Error states not designed.</w:t>
             </w:r>
           </w:p>
         </w:tc>
@@ -14980,13 +15970,7 @@
         <w:rPr>
           <w:rFonts w:ascii="Calibri" w:hAnsi="Calibri" w:cs="Calibri"/>
         </w:rPr>
-        <w:t>: H</w:t>
-      </w:r>
-      <w:r>
-        <w:rPr>
-          <w:rFonts w:ascii="Calibri" w:hAnsi="Calibri" w:cs="Calibri"/>
-        </w:rPr>
-        <w:t>euristic evaluation</w:t>
+        <w:t>: Heuristic evaluation</w:t>
       </w:r>
     </w:p>
     <w:p>
@@ -15001,19 +15985,7 @@
         <w:rPr>
           <w:rFonts w:cs="Calibri"/>
         </w:rPr>
-        <w:t>5.</w:t>
-      </w:r>
-      <w:r>
-        <w:rPr>
-          <w:rFonts w:cs="Calibri"/>
-        </w:rPr>
-        <w:t>3</w:t>
-      </w:r>
-      <w:r>
-        <w:rPr>
-          <w:rFonts w:cs="Calibri"/>
-        </w:rPr>
-        <w:t xml:space="preserve"> </w:t>
+        <w:t xml:space="preserve">5.3 </w:t>
       </w:r>
       <w:r>
         <w:rPr>
@@ -15108,16 +16080,7 @@
           <w:szCs w:val="22"/>
           <w:lang w:eastAsia="en-US"/>
         </w:rPr>
-        <w:t xml:space="preserve">. </w:t>
-      </w:r>
-      <w:r>
-        <w:rPr>
-          <w:rFonts w:ascii="Calibri" w:hAnsi="Calibri" w:cs="Calibri"/>
-          <w:sz w:val="22"/>
-          <w:szCs w:val="22"/>
-          <w:lang w:eastAsia="en-US"/>
-        </w:rPr>
-        <w:t>Contrast ratios were computed using the color values.</w:t>
+        <w:t>. Contrast ratios were computed using the color values.</w:t>
       </w:r>
     </w:p>
     <w:tbl>
@@ -15304,23 +16267,13 @@
                 <w:szCs w:val="22"/>
               </w:rPr>
             </w:pPr>
-            <w:proofErr w:type="gramStart"/>
-            <w:r>
-              <w:rPr>
-                <w:rFonts w:ascii="Calibri" w:eastAsia="Calibri" w:hAnsi="Calibri" w:cs="Calibri"/>
-                <w:sz w:val="22"/>
-                <w:szCs w:val="22"/>
-              </w:rPr>
-              <w:t>16.35 :</w:t>
-            </w:r>
-            <w:proofErr w:type="gramEnd"/>
-            <w:r>
-              <w:rPr>
-                <w:rFonts w:ascii="Calibri" w:eastAsia="Calibri" w:hAnsi="Calibri" w:cs="Calibri"/>
-                <w:sz w:val="22"/>
-                <w:szCs w:val="22"/>
-              </w:rPr>
-              <w:t xml:space="preserve"> 1</w:t>
+            <w:r>
+              <w:rPr>
+                <w:rFonts w:ascii="Calibri" w:eastAsia="Calibri" w:hAnsi="Calibri" w:cs="Calibri"/>
+                <w:sz w:val="22"/>
+                <w:szCs w:val="22"/>
+              </w:rPr>
+              <w:t>16.35 : 1</w:t>
             </w:r>
           </w:p>
         </w:tc>
@@ -15414,23 +16367,13 @@
                 <w:szCs w:val="22"/>
               </w:rPr>
             </w:pPr>
-            <w:proofErr w:type="gramStart"/>
-            <w:r>
-              <w:rPr>
-                <w:rFonts w:ascii="Calibri" w:eastAsia="Calibri" w:hAnsi="Calibri" w:cs="Calibri"/>
-                <w:sz w:val="22"/>
-                <w:szCs w:val="22"/>
-              </w:rPr>
-              <w:t>13.36 :</w:t>
-            </w:r>
-            <w:proofErr w:type="gramEnd"/>
-            <w:r>
-              <w:rPr>
-                <w:rFonts w:ascii="Calibri" w:eastAsia="Calibri" w:hAnsi="Calibri" w:cs="Calibri"/>
-                <w:sz w:val="22"/>
-                <w:szCs w:val="22"/>
-              </w:rPr>
-              <w:t xml:space="preserve"> 1</w:t>
+            <w:r>
+              <w:rPr>
+                <w:rFonts w:ascii="Calibri" w:eastAsia="Calibri" w:hAnsi="Calibri" w:cs="Calibri"/>
+                <w:sz w:val="22"/>
+                <w:szCs w:val="22"/>
+              </w:rPr>
+              <w:t>13.36 : 1</w:t>
             </w:r>
           </w:p>
         </w:tc>
@@ -15527,23 +16470,13 @@
                 <w:szCs w:val="22"/>
               </w:rPr>
             </w:pPr>
-            <w:proofErr w:type="gramStart"/>
-            <w:r>
-              <w:rPr>
-                <w:rFonts w:ascii="Calibri" w:eastAsia="Calibri" w:hAnsi="Calibri" w:cs="Calibri"/>
-                <w:sz w:val="22"/>
-                <w:szCs w:val="22"/>
-              </w:rPr>
-              <w:t>8.37 :</w:t>
-            </w:r>
-            <w:proofErr w:type="gramEnd"/>
-            <w:r>
-              <w:rPr>
-                <w:rFonts w:ascii="Calibri" w:eastAsia="Calibri" w:hAnsi="Calibri" w:cs="Calibri"/>
-                <w:sz w:val="22"/>
-                <w:szCs w:val="22"/>
-              </w:rPr>
-              <w:t xml:space="preserve"> 1</w:t>
+            <w:r>
+              <w:rPr>
+                <w:rFonts w:ascii="Calibri" w:eastAsia="Calibri" w:hAnsi="Calibri" w:cs="Calibri"/>
+                <w:sz w:val="22"/>
+                <w:szCs w:val="22"/>
+              </w:rPr>
+              <w:t>8.37 : 1</w:t>
             </w:r>
           </w:p>
         </w:tc>
@@ -15637,23 +16570,13 @@
                 <w:szCs w:val="22"/>
               </w:rPr>
             </w:pPr>
-            <w:proofErr w:type="gramStart"/>
-            <w:r>
-              <w:rPr>
-                <w:rFonts w:ascii="Calibri" w:eastAsia="Calibri" w:hAnsi="Calibri" w:cs="Calibri"/>
-                <w:sz w:val="22"/>
-                <w:szCs w:val="22"/>
-              </w:rPr>
-              <w:t>13.55 :</w:t>
-            </w:r>
-            <w:proofErr w:type="gramEnd"/>
-            <w:r>
-              <w:rPr>
-                <w:rFonts w:ascii="Calibri" w:eastAsia="Calibri" w:hAnsi="Calibri" w:cs="Calibri"/>
-                <w:sz w:val="22"/>
-                <w:szCs w:val="22"/>
-              </w:rPr>
-              <w:t xml:space="preserve"> 1</w:t>
+            <w:r>
+              <w:rPr>
+                <w:rFonts w:ascii="Calibri" w:eastAsia="Calibri" w:hAnsi="Calibri" w:cs="Calibri"/>
+                <w:sz w:val="22"/>
+                <w:szCs w:val="22"/>
+              </w:rPr>
+              <w:t>13.55 : 1</w:t>
             </w:r>
           </w:p>
         </w:tc>
@@ -15750,23 +16673,13 @@
                 <w:szCs w:val="22"/>
               </w:rPr>
             </w:pPr>
-            <w:proofErr w:type="gramStart"/>
-            <w:r>
-              <w:rPr>
-                <w:rFonts w:ascii="Calibri" w:eastAsia="Calibri" w:hAnsi="Calibri" w:cs="Calibri"/>
-                <w:sz w:val="22"/>
-                <w:szCs w:val="22"/>
-              </w:rPr>
-              <w:t>7.82 :</w:t>
-            </w:r>
-            <w:proofErr w:type="gramEnd"/>
-            <w:r>
-              <w:rPr>
-                <w:rFonts w:ascii="Calibri" w:eastAsia="Calibri" w:hAnsi="Calibri" w:cs="Calibri"/>
-                <w:sz w:val="22"/>
-                <w:szCs w:val="22"/>
-              </w:rPr>
-              <w:t xml:space="preserve"> 1</w:t>
+            <w:r>
+              <w:rPr>
+                <w:rFonts w:ascii="Calibri" w:eastAsia="Calibri" w:hAnsi="Calibri" w:cs="Calibri"/>
+                <w:sz w:val="22"/>
+                <w:szCs w:val="22"/>
+              </w:rPr>
+              <w:t>7.82 : 1</w:t>
             </w:r>
           </w:p>
         </w:tc>
@@ -15860,23 +16773,13 @@
                 <w:szCs w:val="22"/>
               </w:rPr>
             </w:pPr>
-            <w:proofErr w:type="gramStart"/>
-            <w:r>
-              <w:rPr>
-                <w:rFonts w:ascii="Calibri" w:eastAsia="Calibri" w:hAnsi="Calibri" w:cs="Calibri"/>
-                <w:sz w:val="22"/>
-                <w:szCs w:val="22"/>
-              </w:rPr>
-              <w:t>5.28 :</w:t>
-            </w:r>
-            <w:proofErr w:type="gramEnd"/>
-            <w:r>
-              <w:rPr>
-                <w:rFonts w:ascii="Calibri" w:eastAsia="Calibri" w:hAnsi="Calibri" w:cs="Calibri"/>
-                <w:sz w:val="22"/>
-                <w:szCs w:val="22"/>
-              </w:rPr>
-              <w:t xml:space="preserve"> 1</w:t>
+            <w:r>
+              <w:rPr>
+                <w:rFonts w:ascii="Calibri" w:eastAsia="Calibri" w:hAnsi="Calibri" w:cs="Calibri"/>
+                <w:sz w:val="22"/>
+                <w:szCs w:val="22"/>
+              </w:rPr>
+              <w:t>5.28 : 1</w:t>
             </w:r>
           </w:p>
         </w:tc>
@@ -15973,23 +16876,13 @@
                 <w:szCs w:val="22"/>
               </w:rPr>
             </w:pPr>
-            <w:proofErr w:type="gramStart"/>
-            <w:r>
-              <w:rPr>
-                <w:rFonts w:ascii="Calibri" w:eastAsia="Calibri" w:hAnsi="Calibri" w:cs="Calibri"/>
-                <w:sz w:val="22"/>
-                <w:szCs w:val="22"/>
-              </w:rPr>
-              <w:t>7.44 :</w:t>
-            </w:r>
-            <w:proofErr w:type="gramEnd"/>
-            <w:r>
-              <w:rPr>
-                <w:rFonts w:ascii="Calibri" w:eastAsia="Calibri" w:hAnsi="Calibri" w:cs="Calibri"/>
-                <w:sz w:val="22"/>
-                <w:szCs w:val="22"/>
-              </w:rPr>
-              <w:t xml:space="preserve"> 1</w:t>
+            <w:r>
+              <w:rPr>
+                <w:rFonts w:ascii="Calibri" w:eastAsia="Calibri" w:hAnsi="Calibri" w:cs="Calibri"/>
+                <w:sz w:val="22"/>
+                <w:szCs w:val="22"/>
+              </w:rPr>
+              <w:t>7.44 : 1</w:t>
             </w:r>
           </w:p>
         </w:tc>
@@ -16103,23 +16996,13 @@
                 <w:szCs w:val="22"/>
               </w:rPr>
             </w:pPr>
-            <w:proofErr w:type="gramStart"/>
-            <w:r>
-              <w:rPr>
-                <w:rFonts w:ascii="Calibri" w:eastAsia="Calibri" w:hAnsi="Calibri" w:cs="Calibri"/>
-                <w:sz w:val="22"/>
-                <w:szCs w:val="22"/>
-              </w:rPr>
-              <w:t>4.48 :</w:t>
-            </w:r>
-            <w:proofErr w:type="gramEnd"/>
-            <w:r>
-              <w:rPr>
-                <w:rFonts w:ascii="Calibri" w:eastAsia="Calibri" w:hAnsi="Calibri" w:cs="Calibri"/>
-                <w:sz w:val="22"/>
-                <w:szCs w:val="22"/>
-              </w:rPr>
-              <w:t xml:space="preserve"> 1</w:t>
+            <w:r>
+              <w:rPr>
+                <w:rFonts w:ascii="Calibri" w:eastAsia="Calibri" w:hAnsi="Calibri" w:cs="Calibri"/>
+                <w:sz w:val="22"/>
+                <w:szCs w:val="22"/>
+              </w:rPr>
+              <w:t>4.48 : 1</w:t>
             </w:r>
           </w:p>
         </w:tc>
@@ -16236,23 +17119,13 @@
                 <w:szCs w:val="22"/>
               </w:rPr>
             </w:pPr>
-            <w:proofErr w:type="gramStart"/>
-            <w:r>
-              <w:rPr>
-                <w:rFonts w:ascii="Calibri" w:eastAsia="Calibri" w:hAnsi="Calibri" w:cs="Calibri"/>
-                <w:sz w:val="22"/>
-                <w:szCs w:val="22"/>
-              </w:rPr>
-              <w:t>5.76 :</w:t>
-            </w:r>
-            <w:proofErr w:type="gramEnd"/>
-            <w:r>
-              <w:rPr>
-                <w:rFonts w:ascii="Calibri" w:eastAsia="Calibri" w:hAnsi="Calibri" w:cs="Calibri"/>
-                <w:sz w:val="22"/>
-                <w:szCs w:val="22"/>
-              </w:rPr>
-              <w:t xml:space="preserve"> 1</w:t>
+            <w:r>
+              <w:rPr>
+                <w:rFonts w:ascii="Calibri" w:eastAsia="Calibri" w:hAnsi="Calibri" w:cs="Calibri"/>
+                <w:sz w:val="22"/>
+                <w:szCs w:val="22"/>
+              </w:rPr>
+              <w:t>5.76 : 1</w:t>
             </w:r>
           </w:p>
         </w:tc>
@@ -16322,19 +17195,7 @@
         <w:rPr>
           <w:rFonts w:cs="Calibri"/>
         </w:rPr>
-        <w:t>5.</w:t>
-      </w:r>
-      <w:r>
-        <w:rPr>
-          <w:rFonts w:cs="Calibri"/>
-        </w:rPr>
-        <w:t>4</w:t>
-      </w:r>
-      <w:r>
-        <w:rPr>
-          <w:rFonts w:cs="Calibri"/>
-        </w:rPr>
-        <w:t xml:space="preserve"> </w:t>
+        <w:t xml:space="preserve">5.4 </w:t>
       </w:r>
       <w:r>
         <w:rPr>
@@ -16430,27 +17291,7 @@
           <w:szCs w:val="22"/>
           <w:lang w:eastAsia="en-US"/>
         </w:rPr>
-        <w:t xml:space="preserve">. Each task will have a maximum of 120 </w:t>
-      </w:r>
-      <w:proofErr w:type="gramStart"/>
-      <w:r>
-        <w:rPr>
-          <w:rFonts w:ascii="Calibri" w:hAnsi="Calibri" w:cs="Calibri"/>
-          <w:sz w:val="22"/>
-          <w:szCs w:val="22"/>
-          <w:lang w:eastAsia="en-US"/>
-        </w:rPr>
-        <w:t>s,</w:t>
-      </w:r>
-      <w:proofErr w:type="gramEnd"/>
-      <w:r>
-        <w:rPr>
-          <w:rFonts w:ascii="Calibri" w:hAnsi="Calibri" w:cs="Calibri"/>
-          <w:sz w:val="22"/>
-          <w:szCs w:val="22"/>
-          <w:lang w:eastAsia="en-US"/>
-        </w:rPr>
-        <w:t xml:space="preserve"> participants provide their informed consent and there will be no actual transactions. Participants will then fill out the System Usability Scale (SUS) </w:t>
+        <w:t xml:space="preserve">. Each task will have a maximum of 120 s, participants provide their informed consent and there will be no actual transactions. Participants will then fill out the System Usability Scale (SUS) </w:t>
       </w:r>
       <w:sdt>
         <w:sdtPr>
@@ -17818,19 +18659,7 @@
           <w:rFonts w:cs="Calibri"/>
         </w:rPr>
         <w:lastRenderedPageBreak/>
-        <w:t>5.</w:t>
-      </w:r>
-      <w:r>
-        <w:rPr>
-          <w:rFonts w:cs="Calibri"/>
-        </w:rPr>
-        <w:t>5</w:t>
-      </w:r>
-      <w:r>
-        <w:rPr>
-          <w:rFonts w:cs="Calibri"/>
-        </w:rPr>
-        <w:t xml:space="preserve"> </w:t>
+        <w:t xml:space="preserve">5.5 </w:t>
       </w:r>
       <w:r>
         <w:rPr>
@@ -19082,7 +19911,13 @@
     <w:sdt>
       <w:sdtPr>
         <w:rPr>
-          <w:rFonts w:cs="Calibri"/>
+          <w:rFonts w:asciiTheme="minorHAnsi" w:eastAsiaTheme="minorEastAsia" w:hAnsiTheme="minorHAnsi" w:cs="Calibri"/>
+          <w:color w:val="auto"/>
+          <w:kern w:val="0"/>
+          <w:sz w:val="24"/>
+          <w:szCs w:val="24"/>
+          <w:lang w:eastAsia="ja-JP"/>
+          <w14:ligatures w14:val="none"/>
         </w:rPr>
         <w:id w:val="1093590177"/>
         <w:docPartObj>
@@ -19090,17 +19925,6 @@
           <w:docPartUnique/>
         </w:docPartObj>
       </w:sdtPr>
-      <w:sdtEndPr>
-        <w:rPr>
-          <w:rFonts w:eastAsiaTheme="minorEastAsia"/>
-          <w:color w:val="auto"/>
-          <w:kern w:val="0"/>
-          <w:sz w:val="24"/>
-          <w:szCs w:val="24"/>
-          <w:lang w:eastAsia="ja-JP"/>
-          <w14:ligatures w14:val="none"/>
-        </w:rPr>
-      </w:sdtEndPr>
       <w:sdtContent>
         <w:p>
           <w:pPr>
@@ -20012,19 +20836,7 @@
         <w:rPr>
           <w:rFonts w:cs="Calibri"/>
         </w:rPr>
-        <w:t xml:space="preserve">Appendix A </w:t>
-      </w:r>
-      <w:r>
-        <w:rPr>
-          <w:rFonts w:cs="Calibri"/>
-        </w:rPr>
-        <w:t>-</w:t>
-      </w:r>
-      <w:r>
-        <w:rPr>
-          <w:rFonts w:cs="Calibri"/>
-        </w:rPr>
-        <w:t xml:space="preserve"> Requirements traceability matrix</w:t>
+        <w:t>Appendix A - Requirements traceability matrix</w:t>
       </w:r>
       <w:bookmarkEnd w:id="32"/>
     </w:p>
@@ -21172,25 +21984,7 @@
                 <w:sz w:val="22"/>
                 <w:szCs w:val="22"/>
               </w:rPr>
-              <w:t xml:space="preserve">Simplified </w:t>
-            </w:r>
-            <w:proofErr w:type="gramStart"/>
-            <w:r>
-              <w:rPr>
-                <w:rFonts w:ascii="Calibri" w:eastAsia="Calibri" w:hAnsi="Calibri" w:cs="Calibri"/>
-                <w:sz w:val="22"/>
-                <w:szCs w:val="22"/>
-              </w:rPr>
-              <w:t>home</w:t>
-            </w:r>
-            <w:proofErr w:type="gramEnd"/>
-            <w:r>
-              <w:rPr>
-                <w:rFonts w:ascii="Calibri" w:eastAsia="Calibri" w:hAnsi="Calibri" w:cs="Calibri"/>
-                <w:sz w:val="22"/>
-                <w:szCs w:val="22"/>
-              </w:rPr>
-              <w:t xml:space="preserve"> (Fig. 3)</w:t>
+              <w:t>Simplified home (Fig. 3)</w:t>
             </w:r>
           </w:p>
         </w:tc>
@@ -21798,23 +22592,13 @@
                 <w:szCs w:val="22"/>
               </w:rPr>
             </w:pPr>
-            <w:proofErr w:type="gramStart"/>
-            <w:r>
-              <w:rPr>
-                <w:rFonts w:ascii="Calibri" w:eastAsia="Calibri" w:hAnsi="Calibri" w:cs="Calibri"/>
-                <w:sz w:val="22"/>
-                <w:szCs w:val="22"/>
-              </w:rPr>
-              <w:t>Transfer</w:t>
-            </w:r>
-            <w:proofErr w:type="gramEnd"/>
-            <w:r>
-              <w:rPr>
-                <w:rFonts w:ascii="Calibri" w:eastAsia="Calibri" w:hAnsi="Calibri" w:cs="Calibri"/>
-                <w:sz w:val="22"/>
-                <w:szCs w:val="22"/>
-              </w:rPr>
-              <w:t xml:space="preserve"> screen, copy buttons (Fig. 3)</w:t>
+            <w:r>
+              <w:rPr>
+                <w:rFonts w:ascii="Calibri" w:eastAsia="Calibri" w:hAnsi="Calibri" w:cs="Calibri"/>
+                <w:sz w:val="22"/>
+                <w:szCs w:val="22"/>
+              </w:rPr>
+              <w:t>Transfer screen, copy buttons (Fig. 3)</w:t>
             </w:r>
           </w:p>
         </w:tc>
@@ -22357,52 +23141,31 @@
     </w:tbl>
     <w:p>
       <w:pPr>
-        <w:rPr>
-          <w:rFonts w:ascii="Calibri" w:hAnsi="Calibri" w:cs="Calibri"/>
-          <w:lang w:eastAsia="en-US"/>
+        <w:pStyle w:val="Heading2"/>
+        <w:rPr>
+          <w:rFonts w:cs="Calibri"/>
         </w:rPr>
       </w:pPr>
-    </w:p>
-    <w:p>
-      <w:pPr>
-        <w:rPr>
-          <w:rFonts w:ascii="Calibri" w:hAnsi="Calibri" w:cs="Calibri"/>
-        </w:rPr>
-      </w:pPr>
-    </w:p>
-    <w:p>
-      <w:pPr>
-        <w:rPr>
-          <w:rFonts w:ascii="Calibri" w:hAnsi="Calibri" w:cs="Calibri"/>
-        </w:rPr>
-      </w:pPr>
-    </w:p>
-    <w:p>
-      <w:pPr>
-        <w:pStyle w:val="Heading2"/>
+      <w:bookmarkStart w:id="33" w:name="_Toc242955396"/>
+      <w:bookmarkStart w:id="34" w:name="_Toc242960550"/>
+      <w:r>
         <w:rPr>
           <w:rFonts w:cs="Calibri"/>
         </w:rPr>
-      </w:pPr>
-      <w:bookmarkStart w:id="33" w:name="_Toc242955395"/>
-      <w:bookmarkStart w:id="34" w:name="_Toc242960549"/>
-      <w:r>
-        <w:rPr>
-          <w:rFonts w:cs="Calibri"/>
-        </w:rPr>
-        <w:t xml:space="preserve">Appendix B </w:t>
+        <w:lastRenderedPageBreak/>
+        <w:t xml:space="preserve">Appendix </w:t>
       </w:r>
       <w:r>
         <w:rPr>
           <w:rFonts w:cs="Calibri"/>
         </w:rPr>
-        <w:t>-</w:t>
+        <w:t>B</w:t>
       </w:r>
       <w:r>
         <w:rPr>
           <w:rFonts w:cs="Calibri"/>
         </w:rPr>
-        <w:t xml:space="preserve"> Low-fidelity wireframes and sketches</w:t>
+        <w:t xml:space="preserve"> - Validation test record sheet</w:t>
       </w:r>
       <w:bookmarkEnd w:id="33"/>
       <w:bookmarkEnd w:id="34"/>
@@ -22414,58 +23177,28 @@
           <w:rFonts w:cs="Calibri"/>
         </w:rPr>
       </w:pPr>
-      <w:bookmarkStart w:id="35" w:name="_Toc242955396"/>
-      <w:bookmarkStart w:id="36" w:name="_Toc242960550"/>
+      <w:bookmarkStart w:id="35" w:name="_Toc242955397"/>
+      <w:bookmarkStart w:id="36" w:name="_Toc242960551"/>
       <w:r>
         <w:rPr>
           <w:rFonts w:cs="Calibri"/>
         </w:rPr>
-        <w:t xml:space="preserve">Appendix C </w:t>
+        <w:t xml:space="preserve">Appendix </w:t>
       </w:r>
       <w:r>
         <w:rPr>
           <w:rFonts w:cs="Calibri"/>
         </w:rPr>
-        <w:t>-</w:t>
+        <w:t>C</w:t>
       </w:r>
       <w:r>
         <w:rPr>
           <w:rFonts w:cs="Calibri"/>
         </w:rPr>
-        <w:t xml:space="preserve"> Validation test record sheet</w:t>
+        <w:t xml:space="preserve"> - Links</w:t>
       </w:r>
       <w:bookmarkEnd w:id="35"/>
       <w:bookmarkEnd w:id="36"/>
-    </w:p>
-    <w:p>
-      <w:pPr>
-        <w:pStyle w:val="Heading2"/>
-        <w:rPr>
-          <w:rFonts w:cs="Calibri"/>
-        </w:rPr>
-      </w:pPr>
-      <w:bookmarkStart w:id="37" w:name="_Toc242955397"/>
-      <w:bookmarkStart w:id="38" w:name="_Toc242960551"/>
-      <w:r>
-        <w:rPr>
-          <w:rFonts w:cs="Calibri"/>
-        </w:rPr>
-        <w:t xml:space="preserve">Appendix D </w:t>
-      </w:r>
-      <w:r>
-        <w:rPr>
-          <w:rFonts w:cs="Calibri"/>
-        </w:rPr>
-        <w:t>-</w:t>
-      </w:r>
-      <w:r>
-        <w:rPr>
-          <w:rFonts w:cs="Calibri"/>
-        </w:rPr>
-        <w:t xml:space="preserve"> Links</w:t>
-      </w:r>
-      <w:bookmarkEnd w:id="37"/>
-      <w:bookmarkEnd w:id="38"/>
     </w:p>
     <w:tbl>
       <w:tblPr>
@@ -22566,7 +23299,7 @@
                 <w:rFonts w:ascii="Calibri" w:hAnsi="Calibri" w:cs="Calibri"/>
               </w:rPr>
             </w:pPr>
-            <w:hyperlink r:id="rId12" w:history="1">
+            <w:hyperlink r:id="rId33" w:history="1">
               <w:r>
                 <w:rPr>
                   <w:rStyle w:val="Hyperlink"/>
@@ -22617,7 +23350,7 @@
                 <w:rFonts w:ascii="Calibri" w:hAnsi="Calibri" w:cs="Calibri"/>
               </w:rPr>
             </w:pPr>
-            <w:hyperlink r:id="rId13" w:history="1">
+            <w:hyperlink r:id="rId34" w:history="1">
               <w:r>
                 <w:rPr>
                   <w:rStyle w:val="Hyperlink"/>
@@ -22723,7 +23456,7 @@
 </file>
 
 <file path=word/endnotes.xml><?xml version="1.0" encoding="utf-8"?>
-<w:endnotes xmlns:wpc="http://schemas.microsoft.com/office/word/2010/wordprocessingCanvas" xmlns:cx="http://schemas.microsoft.com/office/drawing/2014/chartex" xmlns:cx1="http://schemas.microsoft.com/office/drawing/2015/9/8/chartex" xmlns:cx2="http://schemas.microsoft.com/office/drawing/2015/10/21/chartex" xmlns:cx3="http://schemas.microsoft.com/office/drawing/2016/5/9/chartex" xmlns:cx4="http://schemas.microsoft.com/office/drawing/2016/5/10/chartex" xmlns:cx5="http://schemas.microsoft.com/office/drawing/2016/5/11/chartex" xmlns:cx6="http://schemas.microsoft.com/office/drawing/2016/5/12/chartex" xmlns:cx7="http://schemas.microsoft.com/office/drawing/2016/5/13/chartex" xmlns:cx8="http://schemas.microsoft.com/office/drawing/2016/5/14/chartex" xmlns:mc="http://schemas.openxmlformats.org/markup-compatibility/2006" xmlns:aink="http://schemas.microsoft.com/office/drawing/2016/ink" xmlns:am3d="http://schemas.microsoft.com/office/drawing/2017/model3d" xmlns:o="urn:schemas-microsoft-com:office:office" xmlns:oel="http://schemas.microsoft.com/office/2019/extlst" xmlns:r="http://schemas.openxmlformats.org/officeDocument/2006/relationships" xmlns:m="http://schemas.openxmlformats.org/officeDocument/2006/math" xmlns:v="urn:schemas-microsoft-com:vml" xmlns:wp14="http://schemas.microsoft.com/office/word/2010/wordprocessingDrawing" xmlns:wp="http://schemas.openxmlformats.org/drawingml/2006/wordprocessingDrawing" xmlns:w10="urn:schemas-microsoft-com:office:word" xmlns:w="http://schemas.openxmlformats.org/wordprocessingml/2006/main" xmlns:w14="http://schemas.microsoft.com/office/word/2010/wordml" xmlns:w15="http://schemas.microsoft.com/office/word/2012/wordml" xmlns:w16cex="http://schemas.microsoft.com/office/word/2018/wordml/cex" xmlns:w16cid="http://schemas.microsoft.com/office/word/2016/wordml/cid" xmlns:w16="http://schemas.microsoft.com/office/word/2018/wordml" xmlns:w16du="http://schemas.microsoft.com/office/word/2023/wordml/word16du" xmlns:w16sdtdh="http://schemas.microsoft.com/office/word/2020/wordml/sdtdatahash" xmlns:w16sdtfl="http://schemas.microsoft.com/office/word/2024/wordml/sdtformatlock" xmlns:w16se="http://schemas.microsoft.com/office/word/2015/wordml/symex" xmlns:wpg="http://schemas.microsoft.com/office/word/2010/wordprocessingGroup" xmlns:wpi="http://schemas.microsoft.com/office/word/2010/wordprocessingInk" xmlns:wne="http://schemas.microsoft.com/office/word/2006/wordml" xmlns:wps="http://schemas.microsoft.com/office/word/2010/wordprocessingShape" mc:Ignorable="w14 w15 w16se w16cid w16 w16cex w16sdtdh w16sdtfl w16du wp14">
+<w:endnotes xmlns:wpc="http://schemas.microsoft.com/office/word/2010/wordprocessingCanvas" xmlns:cx="http://schemas.microsoft.com/office/drawing/2014/chartex" xmlns:cx1="http://schemas.microsoft.com/office/drawing/2015/9/8/chartex" xmlns:cx2="http://schemas.microsoft.com/office/drawing/2015/10/21/chartex" xmlns:cx3="http://schemas.microsoft.com/office/drawing/2016/5/9/chartex" xmlns:cx4="http://schemas.microsoft.com/office/drawing/2016/5/10/chartex" xmlns:cx5="http://schemas.microsoft.com/office/drawing/2016/5/11/chartex" xmlns:cx6="http://schemas.microsoft.com/office/drawing/2016/5/12/chartex" xmlns:cx7="http://schemas.microsoft.com/office/drawing/2016/5/13/chartex" xmlns:cx8="http://schemas.microsoft.com/office/drawing/2016/5/14/chartex" xmlns:mc="http://schemas.openxmlformats.org/markup-compatibility/2006" xmlns:aink="http://schemas.microsoft.com/office/drawing/2016/ink" xmlns:am3d="http://schemas.microsoft.com/office/drawing/2017/model3d" xmlns:o="urn:schemas-microsoft-com:office:office" xmlns:oel="http://schemas.microsoft.com/office/2019/extlst" xmlns:r="http://schemas.openxmlformats.org/officeDocument/2006/relationships" xmlns:m="http://schemas.openxmlformats.org/officeDocument/2006/math" xmlns:v="urn:schemas-microsoft-com:vml" xmlns:wp14="http://schemas.microsoft.com/office/word/2010/wordprocessingDrawing" xmlns:wp="http://schemas.openxmlformats.org/drawingml/2006/wordprocessingDrawing" xmlns:w10="urn:schemas-microsoft-com:office:word" xmlns:w="http://schemas.openxmlformats.org/wordprocessingml/2006/main" xmlns:w14="http://schemas.microsoft.com/office/word/2010/wordml" xmlns:w15="http://schemas.microsoft.com/office/word/2012/wordml" xmlns:w16cex="http://schemas.microsoft.com/office/word/2018/wordml/cex" xmlns:w16cid="http://schemas.microsoft.com/office/word/2016/wordml/cid" xmlns:w16="http://schemas.microsoft.com/office/word/2018/wordml" xmlns:w16sdtdh="http://schemas.microsoft.com/office/word/2020/wordml/sdtdatahash" xmlns:w16se="http://schemas.microsoft.com/office/word/2015/wordml/symex" xmlns:wpg="http://schemas.microsoft.com/office/word/2010/wordprocessingGroup" xmlns:wpi="http://schemas.microsoft.com/office/word/2010/wordprocessingInk" xmlns:wne="http://schemas.microsoft.com/office/word/2006/wordml" xmlns:wps="http://schemas.microsoft.com/office/word/2010/wordprocessingShape" mc:Ignorable="w14 w15 w16se w16cid w16 w16cex w16sdtdh wp14">
   <w:endnote w:type="separator" w:id="-1">
     <w:p>
       <w:pPr>
@@ -22748,7 +23481,7 @@
 </file>
 
 <file path=word/footnotes.xml><?xml version="1.0" encoding="utf-8"?>
-<w:footnotes xmlns:wpc="http://schemas.microsoft.com/office/word/2010/wordprocessingCanvas" xmlns:cx="http://schemas.microsoft.com/office/drawing/2014/chartex" xmlns:cx1="http://schemas.microsoft.com/office/drawing/2015/9/8/chartex" xmlns:cx2="http://schemas.microsoft.com/office/drawing/2015/10/21/chartex" xmlns:cx3="http://schemas.microsoft.com/office/drawing/2016/5/9/chartex" xmlns:cx4="http://schemas.microsoft.com/office/drawing/2016/5/10/chartex" xmlns:cx5="http://schemas.microsoft.com/office/drawing/2016/5/11/chartex" xmlns:cx6="http://schemas.microsoft.com/office/drawing/2016/5/12/chartex" xmlns:cx7="http://schemas.microsoft.com/office/drawing/2016/5/13/chartex" xmlns:cx8="http://schemas.microsoft.com/office/drawing/2016/5/14/chartex" xmlns:mc="http://schemas.openxmlformats.org/markup-compatibility/2006" xmlns:aink="http://schemas.microsoft.com/office/drawing/2016/ink" xmlns:am3d="http://schemas.microsoft.com/office/drawing/2017/model3d" xmlns:o="urn:schemas-microsoft-com:office:office" xmlns:oel="http://schemas.microsoft.com/office/2019/extlst" xmlns:r="http://schemas.openxmlformats.org/officeDocument/2006/relationships" xmlns:m="http://schemas.openxmlformats.org/officeDocument/2006/math" xmlns:v="urn:schemas-microsoft-com:vml" xmlns:wp14="http://schemas.microsoft.com/office/word/2010/wordprocessingDrawing" xmlns:wp="http://schemas.openxmlformats.org/drawingml/2006/wordprocessingDrawing" xmlns:w10="urn:schemas-microsoft-com:office:word" xmlns:w="http://schemas.openxmlformats.org/wordprocessingml/2006/main" xmlns:w14="http://schemas.microsoft.com/office/word/2010/wordml" xmlns:w15="http://schemas.microsoft.com/office/word/2012/wordml" xmlns:w16cex="http://schemas.microsoft.com/office/word/2018/wordml/cex" xmlns:w16cid="http://schemas.microsoft.com/office/word/2016/wordml/cid" xmlns:w16="http://schemas.microsoft.com/office/word/2018/wordml" xmlns:w16du="http://schemas.microsoft.com/office/word/2023/wordml/word16du" xmlns:w16sdtdh="http://schemas.microsoft.com/office/word/2020/wordml/sdtdatahash" xmlns:w16sdtfl="http://schemas.microsoft.com/office/word/2024/wordml/sdtformatlock" xmlns:w16se="http://schemas.microsoft.com/office/word/2015/wordml/symex" xmlns:wpg="http://schemas.microsoft.com/office/word/2010/wordprocessingGroup" xmlns:wpi="http://schemas.microsoft.com/office/word/2010/wordprocessingInk" xmlns:wne="http://schemas.microsoft.com/office/word/2006/wordml" xmlns:wps="http://schemas.microsoft.com/office/word/2010/wordprocessingShape" mc:Ignorable="w14 w15 w16se w16cid w16 w16cex w16sdtdh w16sdtfl w16du wp14">
+<w:footnotes xmlns:wpc="http://schemas.microsoft.com/office/word/2010/wordprocessingCanvas" xmlns:cx="http://schemas.microsoft.com/office/drawing/2014/chartex" xmlns:cx1="http://schemas.microsoft.com/office/drawing/2015/9/8/chartex" xmlns:cx2="http://schemas.microsoft.com/office/drawing/2015/10/21/chartex" xmlns:cx3="http://schemas.microsoft.com/office/drawing/2016/5/9/chartex" xmlns:cx4="http://schemas.microsoft.com/office/drawing/2016/5/10/chartex" xmlns:cx5="http://schemas.microsoft.com/office/drawing/2016/5/11/chartex" xmlns:cx6="http://schemas.microsoft.com/office/drawing/2016/5/12/chartex" xmlns:cx7="http://schemas.microsoft.com/office/drawing/2016/5/13/chartex" xmlns:cx8="http://schemas.microsoft.com/office/drawing/2016/5/14/chartex" xmlns:mc="http://schemas.openxmlformats.org/markup-compatibility/2006" xmlns:aink="http://schemas.microsoft.com/office/drawing/2016/ink" xmlns:am3d="http://schemas.microsoft.com/office/drawing/2017/model3d" xmlns:o="urn:schemas-microsoft-com:office:office" xmlns:oel="http://schemas.microsoft.com/office/2019/extlst" xmlns:r="http://schemas.openxmlformats.org/officeDocument/2006/relationships" xmlns:m="http://schemas.openxmlformats.org/officeDocument/2006/math" xmlns:v="urn:schemas-microsoft-com:vml" xmlns:wp14="http://schemas.microsoft.com/office/word/2010/wordprocessingDrawing" xmlns:wp="http://schemas.openxmlformats.org/drawingml/2006/wordprocessingDrawing" xmlns:w10="urn:schemas-microsoft-com:office:word" xmlns:w="http://schemas.openxmlformats.org/wordprocessingml/2006/main" xmlns:w14="http://schemas.microsoft.com/office/word/2010/wordml" xmlns:w15="http://schemas.microsoft.com/office/word/2012/wordml" xmlns:w16cex="http://schemas.microsoft.com/office/word/2018/wordml/cex" xmlns:w16cid="http://schemas.microsoft.com/office/word/2016/wordml/cid" xmlns:w16="http://schemas.microsoft.com/office/word/2018/wordml" xmlns:w16sdtdh="http://schemas.microsoft.com/office/word/2020/wordml/sdtdatahash" xmlns:w16se="http://schemas.microsoft.com/office/word/2015/wordml/symex" xmlns:wpg="http://schemas.microsoft.com/office/word/2010/wordprocessingGroup" xmlns:wpi="http://schemas.microsoft.com/office/word/2010/wordprocessingInk" xmlns:wne="http://schemas.microsoft.com/office/word/2006/wordml" xmlns:wps="http://schemas.microsoft.com/office/word/2010/wordprocessingShape" mc:Ignorable="w14 w15 w16se w16cid w16 w16cex w16sdtdh wp14">
   <w:footnote w:type="separator" w:id="-1">
     <w:p>
       <w:pPr>
@@ -22773,7 +23506,7 @@
 </file>
 
 <file path=word/numbering.xml><?xml version="1.0" encoding="utf-8"?>
-<w:numbering xmlns:wpc="http://schemas.microsoft.com/office/word/2010/wordprocessingCanvas" xmlns:cx="http://schemas.microsoft.com/office/drawing/2014/chartex" xmlns:cx1="http://schemas.microsoft.com/office/drawing/2015/9/8/chartex" xmlns:cx2="http://schemas.microsoft.com/office/drawing/2015/10/21/chartex" xmlns:cx3="http://schemas.microsoft.com/office/drawing/2016/5/9/chartex" xmlns:cx4="http://schemas.microsoft.com/office/drawing/2016/5/10/chartex" xmlns:cx5="http://schemas.microsoft.com/office/drawing/2016/5/11/chartex" xmlns:cx6="http://schemas.microsoft.com/office/drawing/2016/5/12/chartex" xmlns:cx7="http://schemas.microsoft.com/office/drawing/2016/5/13/chartex" xmlns:cx8="http://schemas.microsoft.com/office/drawing/2016/5/14/chartex" xmlns:mc="http://schemas.openxmlformats.org/markup-compatibility/2006" xmlns:aink="http://schemas.microsoft.com/office/drawing/2016/ink" xmlns:am3d="http://schemas.microsoft.com/office/drawing/2017/model3d" xmlns:o="urn:schemas-microsoft-com:office:office" xmlns:oel="http://schemas.microsoft.com/office/2019/extlst" xmlns:r="http://schemas.openxmlformats.org/officeDocument/2006/relationships" xmlns:m="http://schemas.openxmlformats.org/officeDocument/2006/math" xmlns:v="urn:schemas-microsoft-com:vml" xmlns:wp14="http://schemas.microsoft.com/office/word/2010/wordprocessingDrawing" xmlns:wp="http://schemas.openxmlformats.org/drawingml/2006/wordprocessingDrawing" xmlns:w10="urn:schemas-microsoft-com:office:word" xmlns:w="http://schemas.openxmlformats.org/wordprocessingml/2006/main" xmlns:w14="http://schemas.microsoft.com/office/word/2010/wordml" xmlns:w15="http://schemas.microsoft.com/office/word/2012/wordml" xmlns:w16cex="http://schemas.microsoft.com/office/word/2018/wordml/cex" xmlns:w16cid="http://schemas.microsoft.com/office/word/2016/wordml/cid" xmlns:w16="http://schemas.microsoft.com/office/word/2018/wordml" xmlns:w16du="http://schemas.microsoft.com/office/word/2023/wordml/word16du" xmlns:w16sdtdh="http://schemas.microsoft.com/office/word/2020/wordml/sdtdatahash" xmlns:w16sdtfl="http://schemas.microsoft.com/office/word/2024/wordml/sdtformatlock" xmlns:w16se="http://schemas.microsoft.com/office/word/2015/wordml/symex" xmlns:wpg="http://schemas.microsoft.com/office/word/2010/wordprocessingGroup" xmlns:wpi="http://schemas.microsoft.com/office/word/2010/wordprocessingInk" xmlns:wne="http://schemas.microsoft.com/office/word/2006/wordml" xmlns:wps="http://schemas.microsoft.com/office/word/2010/wordprocessingShape" mc:Ignorable="w14 w15 w16se w16cid w16 w16cex w16sdtdh w16sdtfl w16du wp14">
+<w:numbering xmlns:wpc="http://schemas.microsoft.com/office/word/2010/wordprocessingCanvas" xmlns:cx="http://schemas.microsoft.com/office/drawing/2014/chartex" xmlns:cx1="http://schemas.microsoft.com/office/drawing/2015/9/8/chartex" xmlns:cx2="http://schemas.microsoft.com/office/drawing/2015/10/21/chartex" xmlns:cx3="http://schemas.microsoft.com/office/drawing/2016/5/9/chartex" xmlns:cx4="http://schemas.microsoft.com/office/drawing/2016/5/10/chartex" xmlns:cx5="http://schemas.microsoft.com/office/drawing/2016/5/11/chartex" xmlns:cx6="http://schemas.microsoft.com/office/drawing/2016/5/12/chartex" xmlns:cx7="http://schemas.microsoft.com/office/drawing/2016/5/13/chartex" xmlns:cx8="http://schemas.microsoft.com/office/drawing/2016/5/14/chartex" xmlns:mc="http://schemas.openxmlformats.org/markup-compatibility/2006" xmlns:aink="http://schemas.microsoft.com/office/drawing/2016/ink" xmlns:am3d="http://schemas.microsoft.com/office/drawing/2017/model3d" xmlns:o="urn:schemas-microsoft-com:office:office" xmlns:oel="http://schemas.microsoft.com/office/2019/extlst" xmlns:r="http://schemas.openxmlformats.org/officeDocument/2006/relationships" xmlns:m="http://schemas.openxmlformats.org/officeDocument/2006/math" xmlns:v="urn:schemas-microsoft-com:vml" xmlns:wp14="http://schemas.microsoft.com/office/word/2010/wordprocessingDrawing" xmlns:wp="http://schemas.openxmlformats.org/drawingml/2006/wordprocessingDrawing" xmlns:w10="urn:schemas-microsoft-com:office:word" xmlns:w="http://schemas.openxmlformats.org/wordprocessingml/2006/main" xmlns:w14="http://schemas.microsoft.com/office/word/2010/wordml" xmlns:w15="http://schemas.microsoft.com/office/word/2012/wordml" xmlns:w16cex="http://schemas.microsoft.com/office/word/2018/wordml/cex" xmlns:w16cid="http://schemas.microsoft.com/office/word/2016/wordml/cid" xmlns:w16="http://schemas.microsoft.com/office/word/2018/wordml" xmlns:w16sdtdh="http://schemas.microsoft.com/office/word/2020/wordml/sdtdatahash" xmlns:w16se="http://schemas.microsoft.com/office/word/2015/wordml/symex" xmlns:wpg="http://schemas.microsoft.com/office/word/2010/wordprocessingGroup" xmlns:wpi="http://schemas.microsoft.com/office/word/2010/wordprocessingInk" xmlns:wne="http://schemas.microsoft.com/office/word/2006/wordml" xmlns:wps="http://schemas.microsoft.com/office/word/2010/wordprocessingShape" mc:Ignorable="w14 w15 w16se w16cid w16 w16cex w16sdtdh wp14">
   <w:abstractNum w:abstractNumId="0" w15:restartNumberingAfterBreak="0">
     <w:nsid w:val="0AA511D0"/>
     <w:multiLevelType w:val="multilevel"/>
@@ -24361,7 +25094,7 @@
 </file>
 
 <file path=word/styles.xml><?xml version="1.0" encoding="utf-8"?>
-<w:styles xmlns:mc="http://schemas.openxmlformats.org/markup-compatibility/2006" xmlns:r="http://schemas.openxmlformats.org/officeDocument/2006/relationships" xmlns:w="http://schemas.openxmlformats.org/wordprocessingml/2006/main" xmlns:w14="http://schemas.microsoft.com/office/word/2010/wordml" xmlns:w15="http://schemas.microsoft.com/office/word/2012/wordml" xmlns:w16cex="http://schemas.microsoft.com/office/word/2018/wordml/cex" xmlns:w16cid="http://schemas.microsoft.com/office/word/2016/wordml/cid" xmlns:w16="http://schemas.microsoft.com/office/word/2018/wordml" xmlns:w16du="http://schemas.microsoft.com/office/word/2023/wordml/word16du" xmlns:w16sdtdh="http://schemas.microsoft.com/office/word/2020/wordml/sdtdatahash" xmlns:w16sdtfl="http://schemas.microsoft.com/office/word/2024/wordml/sdtformatlock" xmlns:w16se="http://schemas.microsoft.com/office/word/2015/wordml/symex" mc:Ignorable="w14 w15 w16se w16cid w16 w16cex w16sdtdh w16sdtfl w16du">
+<w:styles xmlns:mc="http://schemas.openxmlformats.org/markup-compatibility/2006" xmlns:r="http://schemas.openxmlformats.org/officeDocument/2006/relationships" xmlns:w="http://schemas.openxmlformats.org/wordprocessingml/2006/main" xmlns:w14="http://schemas.microsoft.com/office/word/2010/wordml" xmlns:w15="http://schemas.microsoft.com/office/word/2012/wordml" xmlns:w16cex="http://schemas.microsoft.com/office/word/2018/wordml/cex" xmlns:w16cid="http://schemas.microsoft.com/office/word/2016/wordml/cid" xmlns:w16="http://schemas.microsoft.com/office/word/2018/wordml" xmlns:w16sdtdh="http://schemas.microsoft.com/office/word/2020/wordml/sdtdatahash" xmlns:w16se="http://schemas.microsoft.com/office/word/2015/wordml/symex" mc:Ignorable="w14 w15 w16se w16cid w16 w16cex w16sdtdh">
   <w:docDefaults>
     <w:rPrDefault>
       <w:rPr>
@@ -24999,6 +25732,7 @@
   <w:style w:type="character" w:default="1" w:styleId="DefaultParagraphFont">
     <w:name w:val="Default Paragraph Font"/>
     <w:uiPriority w:val="1"/>
+    <w:semiHidden/>
     <w:unhideWhenUsed/>
   </w:style>
   <w:style w:type="table" w:default="1" w:styleId="TableNormal">

</xml_diff>